<commit_message>
Corrigir inicializacao do atualizador
</commit_message>
<xml_diff>
--- a/Manual-do-Usuario-Mavi-SFTP.docx
+++ b/Manual-do-Usuario-Mavi-SFTP.docx
@@ -895,6 +895,19 @@
         <w:spacing w:after="20"/>
       </w:pPr>
     </w:p>
+    <w:p>
+      <w:pPr>
+        <w:pStyle w:val="Heading2"/>
+      </w:pPr>
+      <w:r>
+        <w:t>2.1 Aviso do Microsoft Defender SmartScreen</w:t>
+      </w:r>
+    </w:p>
+    <w:p>
+      <w:r>
+        <w:t>Como o instalador atual ainda não possui uma assinatura digital reconhecida, o Windows pode exibir a mensagem “O Windows protegeu o computador” e informar que o Microsoft Defender SmartScreen impediu a execução de um aplicativo não reconhecido.</w:t>
+      </w:r>
+    </w:p>
     <w:tbl>
       <w:tblPr>
         <w:tblW w:type="auto" w:w="0"/>
@@ -929,7 +942,7 @@
                 <w:color w:val="A83232"/>
                 <w:sz w:val="20"/>
               </w:rPr>
-              <w:t xml:space="preserve">Windows SmartScreen: </w:t>
+              <w:t xml:space="preserve">O que significa: </w:t>
             </w:r>
             <w:r>
               <w:rPr>
@@ -939,7 +952,7 @@
                 <w:color w:val="16202A"/>
                 <w:sz w:val="20"/>
               </w:rPr>
-              <w:t>Em instalações sem assinatura digital, o Windows pode exibir um aviso de aplicativo não reconhecido. Confirme a origem do instalador antes de continuar.</w:t>
+              <w:t>Esse aviso indica que o Windows ainda não conseguiu confirmar a identidade do publicador ou estabelecer reputação para aquela versão do arquivo. Ele não significa, por si só, que um vírus foi detectado.</w:t>
             </w:r>
           </w:p>
         </w:tc>
@@ -949,6 +962,131 @@
       <w:pPr>
         <w:spacing w:after="20"/>
       </w:pPr>
+    </w:p>
+    <w:p>
+      <w:r>
+        <w:t>Prossiga somente quando o instalador tiver sido obtido na Release oficial do repositório do Mavi SFTP ou enviado diretamente por uma pessoa responsável pelo aplicativo.</w:t>
+      </w:r>
+    </w:p>
+    <w:p>
+      <w:pPr>
+        <w:pStyle w:val="ListNumber"/>
+      </w:pPr>
+      <w:r>
+        <w:rPr>
+          <w:rFonts w:ascii="Calibri" w:hAnsi="Calibri"/>
+          <w:b w:val="0"/>
+          <w:i w:val="0"/>
+          <w:color w:val="16202A"/>
+          <w:sz w:val="21"/>
+        </w:rPr>
+        <w:t>Na tela do SmartScreen, confirme que o arquivo aberto é o instalador esperado do Mavi SFTP.</w:t>
+      </w:r>
+    </w:p>
+    <w:p>
+      <w:pPr>
+        <w:pStyle w:val="ListNumber"/>
+      </w:pPr>
+      <w:r>
+        <w:rPr>
+          <w:rFonts w:ascii="Calibri" w:hAnsi="Calibri"/>
+          <w:b w:val="0"/>
+          <w:i w:val="0"/>
+          <w:color w:val="16202A"/>
+          <w:sz w:val="21"/>
+        </w:rPr>
+        <w:t>Clique em Mais informações.</w:t>
+      </w:r>
+    </w:p>
+    <w:p>
+      <w:pPr>
+        <w:pStyle w:val="ListNumber"/>
+      </w:pPr>
+      <w:r>
+        <w:rPr>
+          <w:rFonts w:ascii="Calibri" w:hAnsi="Calibri"/>
+          <w:b w:val="0"/>
+          <w:i w:val="0"/>
+          <w:color w:val="16202A"/>
+          <w:sz w:val="21"/>
+        </w:rPr>
+        <w:t>Verifique novamente o nome do aplicativo e a origem do arquivo.</w:t>
+      </w:r>
+    </w:p>
+    <w:p>
+      <w:pPr>
+        <w:pStyle w:val="ListNumber"/>
+      </w:pPr>
+      <w:r>
+        <w:rPr>
+          <w:rFonts w:ascii="Calibri" w:hAnsi="Calibri"/>
+          <w:b w:val="0"/>
+          <w:i w:val="0"/>
+          <w:color w:val="16202A"/>
+          <w:sz w:val="21"/>
+        </w:rPr>
+        <w:t>Clique em Executar assim mesmo para iniciar a instalação.</w:t>
+      </w:r>
+    </w:p>
+    <w:tbl>
+      <w:tblPr>
+        <w:tblW w:type="auto" w:w="0"/>
+        <w:jc w:val="center"/>
+        <w:tblLayout w:type="fixed"/>
+        <w:tblLook w:firstColumn="1" w:firstRow="1" w:lastColumn="0" w:lastRow="0" w:noHBand="0" w:noVBand="1" w:val="04A0"/>
+      </w:tblPr>
+      <w:tblGrid>
+        <w:gridCol w:w="9792"/>
+      </w:tblGrid>
+      <w:tr>
+        <w:tc>
+          <w:tcPr>
+            <w:tcW w:type="dxa" w:w="9576"/>
+            <w:shd w:fill="FDEEEE"/>
+            <w:tcMar>
+              <w:top w:w="120" w:type="dxa"/>
+              <w:start w:w="160" w:type="dxa"/>
+              <w:bottom w:w="120" w:type="dxa"/>
+              <w:end w:w="160" w:type="dxa"/>
+            </w:tcMar>
+          </w:tcPr>
+          <w:p>
+            <w:pPr>
+              <w:spacing w:after="0"/>
+            </w:pPr>
+            <w:r>
+              <w:rPr>
+                <w:rFonts w:ascii="Calibri" w:hAnsi="Calibri"/>
+                <w:b/>
+                <w:i w:val="0"/>
+                <w:color w:val="A83232"/>
+                <w:sz w:val="20"/>
+              </w:rPr>
+              <w:t xml:space="preserve">Não prossiga: </w:t>
+            </w:r>
+            <w:r>
+              <w:rPr>
+                <w:rFonts w:ascii="Calibri" w:hAnsi="Calibri"/>
+                <w:b w:val="0"/>
+                <w:i w:val="0"/>
+                <w:color w:val="16202A"/>
+                <w:sz w:val="20"/>
+              </w:rPr>
+              <w:t>Se o arquivo veio de um link desconhecido, mensagem suspeita, site não oficial ou fonte que você não consegue confirmar, cancele a instalação e solicite um novo arquivo à equipe responsável.</w:t>
+            </w:r>
+          </w:p>
+        </w:tc>
+      </w:tr>
+    </w:tbl>
+    <w:p>
+      <w:pPr>
+        <w:spacing w:after="20"/>
+      </w:pPr>
+    </w:p>
+    <w:p>
+      <w:r>
+        <w:t>O aviso pode reaparecer em novas versões porque cada instalador possui um arquivo e um hash diferentes. A solução definitiva é assinar digitalmente o aplicativo com um certificado de assinatura de código confiável. Até que essa assinatura seja configurada, o aviso é esperado em computadores que ainda não reconhecem o instalador.</w:t>
+      </w:r>
     </w:p>
     <w:p>
       <w:pPr>

</xml_diff>

<commit_message>
Corrigir publicacao dos arquivos da Release
</commit_message>
<xml_diff>
--- a/Manual-do-Usuario-Mavi-SFTP.docx
+++ b/Manual-do-Usuario-Mavi-SFTP.docx
@@ -4,7 +4,7 @@
   <w:body>
     <w:p>
       <w:pPr>
-        <w:spacing w:before="1440"/>
+        <w:spacing w:before="1700"/>
         <w:jc w:val="center"/>
       </w:pPr>
       <w:r>
@@ -44,7 +44,7 @@
     </w:p>
     <w:p>
       <w:pPr>
-        <w:spacing w:before="700" w:after="160"/>
+        <w:spacing w:before="760"/>
         <w:jc w:val="center"/>
       </w:pPr>
       <w:r>
@@ -60,7 +60,6 @@
     </w:p>
     <w:p>
       <w:pPr>
-        <w:spacing w:after="360"/>
         <w:jc w:val="center"/>
       </w:pPr>
       <w:r>
@@ -69,14 +68,14 @@
           <w:b w:val="0"/>
           <w:i w:val="0"/>
           <w:color w:val="00B8D4"/>
-          <w:sz w:val="30"/>
+          <w:sz w:val="32"/>
         </w:rPr>
-        <w:t>Cliente SFTP para Windows</w:t>
+        <w:t>Mavi SFTP</w:t>
       </w:r>
     </w:p>
     <w:p>
       <w:pPr>
-        <w:spacing w:before="1400"/>
+        <w:spacing w:before="1700"/>
         <w:jc w:val="center"/>
       </w:pPr>
       <w:r>
@@ -85,25 +84,9 @@
           <w:b w:val="0"/>
           <w:i w:val="0"/>
           <w:color w:val="5D6873"/>
-          <w:sz w:val="23"/>
+          <w:sz w:val="22"/>
         </w:rPr>
-        <w:t>Conexão, navegação, transferência e conversão de arquivos</w:t>
-      </w:r>
-    </w:p>
-    <w:p>
-      <w:pPr>
-        <w:spacing w:before="1400"/>
-        <w:jc w:val="center"/>
-      </w:pPr>
-      <w:r>
-        <w:rPr>
-          <w:rFonts w:ascii="Calibri" w:hAnsi="Calibri"/>
-          <w:b w:val="0"/>
-          <w:i w:val="0"/>
-          <w:color w:val="5D6873"/>
-          <w:sz w:val="19"/>
-        </w:rPr>
-        <w:t>Versão do manual: 1.0  |  Julho de 2026</w:t>
+        <w:t>Guia rápido com detalhamento do tratamento de bases diárias</w:t>
       </w:r>
     </w:p>
     <w:p>
@@ -116,300 +99,12 @@
         <w:pStyle w:val="Heading1"/>
       </w:pPr>
       <w:r>
-        <w:t>Sumário</w:t>
-      </w:r>
-    </w:p>
-    <w:p>
-      <w:pPr>
-        <w:pStyle w:val="ListBullet"/>
-      </w:pPr>
-      <w:r>
-        <w:rPr>
-          <w:rFonts w:ascii="Calibri" w:hAnsi="Calibri"/>
-          <w:b w:val="0"/>
-          <w:i w:val="0"/>
-          <w:color w:val="16202A"/>
-          <w:sz w:val="21"/>
-        </w:rPr>
-        <w:t>1. Sobre o Mavi SFTP</w:t>
-      </w:r>
-    </w:p>
-    <w:p>
-      <w:pPr>
-        <w:pStyle w:val="ListBullet"/>
-      </w:pPr>
-      <w:r>
-        <w:rPr>
-          <w:rFonts w:ascii="Calibri" w:hAnsi="Calibri"/>
-          <w:b w:val="0"/>
-          <w:i w:val="0"/>
-          <w:color w:val="16202A"/>
-          <w:sz w:val="21"/>
-        </w:rPr>
-        <w:t>2. Instalação e abertura</w:t>
-      </w:r>
-    </w:p>
-    <w:p>
-      <w:pPr>
-        <w:pStyle w:val="ListBullet"/>
-      </w:pPr>
-      <w:r>
-        <w:rPr>
-          <w:rFonts w:ascii="Calibri" w:hAnsi="Calibri"/>
-          <w:b w:val="0"/>
-          <w:i w:val="0"/>
-          <w:color w:val="16202A"/>
-          <w:sz w:val="21"/>
-        </w:rPr>
-        <w:t>3. Conhecendo a interface</w:t>
-      </w:r>
-    </w:p>
-    <w:p>
-      <w:pPr>
-        <w:pStyle w:val="ListBullet"/>
-      </w:pPr>
-      <w:r>
-        <w:rPr>
-          <w:rFonts w:ascii="Calibri" w:hAnsi="Calibri"/>
-          <w:b w:val="0"/>
-          <w:i w:val="0"/>
-          <w:color w:val="16202A"/>
-          <w:sz w:val="21"/>
-        </w:rPr>
-        <w:t>4. Conectar e desconectar</w:t>
-      </w:r>
-    </w:p>
-    <w:p>
-      <w:pPr>
-        <w:pStyle w:val="ListBullet"/>
-      </w:pPr>
-      <w:r>
-        <w:rPr>
-          <w:rFonts w:ascii="Calibri" w:hAnsi="Calibri"/>
-          <w:b w:val="0"/>
-          <w:i w:val="0"/>
-          <w:color w:val="16202A"/>
-          <w:sz w:val="21"/>
-        </w:rPr>
-        <w:t>5. Favoritos</w:t>
-      </w:r>
-    </w:p>
-    <w:p>
-      <w:pPr>
-        <w:pStyle w:val="ListBullet"/>
-      </w:pPr>
-      <w:r>
-        <w:rPr>
-          <w:rFonts w:ascii="Calibri" w:hAnsi="Calibri"/>
-          <w:b w:val="0"/>
-          <w:i w:val="0"/>
-          <w:color w:val="16202A"/>
-          <w:sz w:val="21"/>
-        </w:rPr>
-        <w:t>6. Navegar, pesquisar e ordenar</w:t>
-      </w:r>
-    </w:p>
-    <w:p>
-      <w:pPr>
-        <w:pStyle w:val="ListBullet"/>
-      </w:pPr>
-      <w:r>
-        <w:rPr>
-          <w:rFonts w:ascii="Calibri" w:hAnsi="Calibri"/>
-          <w:b w:val="0"/>
-          <w:i w:val="0"/>
-          <w:color w:val="16202A"/>
-          <w:sz w:val="21"/>
-        </w:rPr>
-        <w:t>7. Download de arquivos</w:t>
-      </w:r>
-    </w:p>
-    <w:p>
-      <w:pPr>
-        <w:pStyle w:val="ListBullet"/>
-      </w:pPr>
-      <w:r>
-        <w:rPr>
-          <w:rFonts w:ascii="Calibri" w:hAnsi="Calibri"/>
-          <w:b w:val="0"/>
-          <w:i w:val="0"/>
-          <w:color w:val="16202A"/>
-          <w:sz w:val="21"/>
-        </w:rPr>
-        <w:t>8. Download e conversão de pastas</w:t>
-      </w:r>
-    </w:p>
-    <w:p>
-      <w:pPr>
-        <w:pStyle w:val="ListBullet"/>
-      </w:pPr>
-      <w:r>
-        <w:rPr>
-          <w:rFonts w:ascii="Calibri" w:hAnsi="Calibri"/>
-          <w:b w:val="0"/>
-          <w:i w:val="0"/>
-          <w:color w:val="16202A"/>
-          <w:sz w:val="21"/>
-        </w:rPr>
-        <w:t>9. Processamento de Venda Diária</w:t>
-      </w:r>
-    </w:p>
-    <w:p>
-      <w:pPr>
-        <w:pStyle w:val="ListBullet"/>
-      </w:pPr>
-      <w:r>
-        <w:rPr>
-          <w:rFonts w:ascii="Calibri" w:hAnsi="Calibri"/>
-          <w:b w:val="0"/>
-          <w:i w:val="0"/>
-          <w:color w:val="16202A"/>
-          <w:sz w:val="21"/>
-        </w:rPr>
-        <w:t>10. Upload e criação de pastas</w:t>
-      </w:r>
-    </w:p>
-    <w:p>
-      <w:pPr>
-        <w:pStyle w:val="ListBullet"/>
-      </w:pPr>
-      <w:r>
-        <w:rPr>
-          <w:rFonts w:ascii="Calibri" w:hAnsi="Calibri"/>
-          <w:b w:val="0"/>
-          <w:i w:val="0"/>
-          <w:color w:val="16202A"/>
-          <w:sz w:val="21"/>
-        </w:rPr>
-        <w:t>11. Renomear e excluir</w:t>
-      </w:r>
-    </w:p>
-    <w:p>
-      <w:pPr>
-        <w:pStyle w:val="ListBullet"/>
-      </w:pPr>
-      <w:r>
-        <w:rPr>
-          <w:rFonts w:ascii="Calibri" w:hAnsi="Calibri"/>
-          <w:b w:val="0"/>
-          <w:i w:val="0"/>
-          <w:color w:val="16202A"/>
-          <w:sz w:val="21"/>
-        </w:rPr>
-        <w:t>12. Acompanhar operações</w:t>
-      </w:r>
-    </w:p>
-    <w:p>
-      <w:pPr>
-        <w:pStyle w:val="ListBullet"/>
-      </w:pPr>
-      <w:r>
-        <w:rPr>
-          <w:rFonts w:ascii="Calibri" w:hAnsi="Calibri"/>
-          <w:b w:val="0"/>
-          <w:i w:val="0"/>
-          <w:color w:val="16202A"/>
-          <w:sz w:val="21"/>
-        </w:rPr>
-        <w:t>13. Boas práticas de segurança</w:t>
-      </w:r>
-    </w:p>
-    <w:p>
-      <w:pPr>
-        <w:pStyle w:val="ListBullet"/>
-      </w:pPr>
-      <w:r>
-        <w:rPr>
-          <w:rFonts w:ascii="Calibri" w:hAnsi="Calibri"/>
-          <w:b w:val="0"/>
-          <w:i w:val="0"/>
-          <w:color w:val="16202A"/>
-          <w:sz w:val="21"/>
-        </w:rPr>
-        <w:t>14. Solução de problemas</w:t>
-      </w:r>
-    </w:p>
-    <w:p>
-      <w:pPr>
-        <w:pStyle w:val="ListBullet"/>
-      </w:pPr>
-      <w:r>
-        <w:rPr>
-          <w:rFonts w:ascii="Calibri" w:hAnsi="Calibri"/>
-          <w:b w:val="0"/>
-          <w:i w:val="0"/>
-          <w:color w:val="16202A"/>
-          <w:sz w:val="21"/>
-        </w:rPr>
-        <w:t>15. Referência rápida</w:t>
-      </w:r>
-    </w:p>
-    <w:tbl>
-      <w:tblPr>
-        <w:tblW w:type="auto" w:w="0"/>
-        <w:jc w:val="center"/>
-        <w:tblLayout w:type="fixed"/>
-        <w:tblLook w:firstColumn="1" w:firstRow="1" w:lastColumn="0" w:lastRow="0" w:noHBand="0" w:noVBand="1" w:val="04A0"/>
-      </w:tblPr>
-      <w:tblGrid>
-        <w:gridCol w:w="9792"/>
-      </w:tblGrid>
-      <w:tr>
-        <w:tc>
-          <w:tcPr>
-            <w:tcW w:type="dxa" w:w="9576"/>
-            <w:shd w:fill="EAF8FB"/>
-            <w:tcMar>
-              <w:top w:w="120" w:type="dxa"/>
-              <w:start w:w="160" w:type="dxa"/>
-              <w:bottom w:w="120" w:type="dxa"/>
-              <w:end w:w="160" w:type="dxa"/>
-            </w:tcMar>
-          </w:tcPr>
-          <w:p>
-            <w:pPr>
-              <w:spacing w:after="0"/>
-            </w:pPr>
-            <w:r>
-              <w:rPr>
-                <w:rFonts w:ascii="Calibri" w:hAnsi="Calibri"/>
-                <w:b/>
-                <w:i w:val="0"/>
-                <w:color w:val="16202A"/>
-                <w:sz w:val="20"/>
-              </w:rPr>
-              <w:t xml:space="preserve">Objetivo: </w:t>
-            </w:r>
-            <w:r>
-              <w:rPr>
-                <w:rFonts w:ascii="Calibri" w:hAnsi="Calibri"/>
-                <w:b w:val="0"/>
-                <w:i w:val="0"/>
-                <w:color w:val="16202A"/>
-                <w:sz w:val="20"/>
-              </w:rPr>
-              <w:t>Este manual descreve todas as funcionalidades disponíveis na versão atual do Mavi SFTP para Windows.</w:t>
-            </w:r>
-          </w:p>
-        </w:tc>
-      </w:tr>
-    </w:tbl>
-    <w:p>
-      <w:pPr>
-        <w:spacing w:after="20"/>
-      </w:pPr>
-    </w:p>
-    <w:p>
-      <w:pPr>
-        <w:pStyle w:val="Heading1"/>
-      </w:pPr>
-      <w:r>
-        <w:t>1. Sobre o Mavi SFTP</w:t>
+        <w:t>1. Visão geral</w:t>
       </w:r>
     </w:p>
     <w:p>
       <w:r>
-        <w:t>O Mavi SFTP é um aplicativo para acessar servidores SFTP com segurança, visualizar pastas remotas e transferir arquivos entre o servidor e o computador. Além das operações comuns de arquivos, ele converte arquivos CSV/TXT em Excel e possui um fluxo específico para bases de vendas diárias.</w:t>
+        <w:t>O Mavi SFTP conecta-se a servidores SFTP para navegar, baixar, converter, enviar e organizar arquivos. O aplicativo também possui um tratamento específico para bases de vendas diárias.</w:t>
       </w:r>
     </w:p>
     <w:tbl>
@@ -501,7 +196,7 @@
                 <w:color w:val="16202A"/>
                 <w:sz w:val="20"/>
               </w:rPr>
-              <w:t>Conexão SFTP</w:t>
+              <w:t>Conexão</w:t>
             </w:r>
           </w:p>
         </w:tc>
@@ -525,7 +220,7 @@
                 <w:color w:val="16202A"/>
                 <w:sz w:val="20"/>
               </w:rPr>
-              <w:t>Acesso por host, porta, usuário e senha.</w:t>
+              <w:t>Host, porta, usuário e senha.</w:t>
             </w:r>
           </w:p>
         </w:tc>
@@ -552,7 +247,7 @@
                 <w:color w:val="16202A"/>
                 <w:sz w:val="20"/>
               </w:rPr>
-              <w:t>Navegação</w:t>
+              <w:t>Arquivos</w:t>
             </w:r>
           </w:p>
         </w:tc>
@@ -576,58 +271,7 @@
                 <w:color w:val="16202A"/>
                 <w:sz w:val="20"/>
               </w:rPr>
-              <w:t>Visualização de pastas, arquivos, caminho atual e arquivos recentes.</w:t>
-            </w:r>
-          </w:p>
-        </w:tc>
-      </w:tr>
-      <w:tr>
-        <w:tc>
-          <w:tcPr>
-            <w:tcW w:type="dxa" w:w="2520"/>
-            <w:shd w:fill="F4F6F8"/>
-            <w:tcMar>
-              <w:top w:w="90" w:type="dxa"/>
-              <w:start w:w="120" w:type="dxa"/>
-              <w:bottom w:w="90" w:type="dxa"/>
-              <w:end w:w="120" w:type="dxa"/>
-            </w:tcMar>
-            <w:vAlign w:val="center"/>
-          </w:tcPr>
-          <w:p>
-            <w:r>
-              <w:rPr>
-                <w:rFonts w:ascii="Calibri" w:hAnsi="Calibri"/>
-                <w:b/>
-                <w:i w:val="0"/>
-                <w:color w:val="16202A"/>
-                <w:sz w:val="20"/>
-              </w:rPr>
-              <w:t>Transferências</w:t>
-            </w:r>
-          </w:p>
-        </w:tc>
-        <w:tc>
-          <w:tcPr>
-            <w:tcW w:type="dxa" w:w="7056"/>
-            <w:tcMar>
-              <w:top w:w="90" w:type="dxa"/>
-              <w:start w:w="120" w:type="dxa"/>
-              <w:bottom w:w="90" w:type="dxa"/>
-              <w:end w:w="120" w:type="dxa"/>
-            </w:tcMar>
-            <w:vAlign w:val="center"/>
-          </w:tcPr>
-          <w:p>
-            <w:r>
-              <w:rPr>
-                <w:rFonts w:ascii="Calibri" w:hAnsi="Calibri"/>
-                <w:b w:val="0"/>
-                <w:i w:val="0"/>
-                <w:color w:val="16202A"/>
-                <w:sz w:val="20"/>
-              </w:rPr>
-              <w:t>Download individual, download em lote e upload.</w:t>
+              <w:t>Navegação, pesquisa, ordenação, download, upload, renomeação e exclusão.</w:t>
             </w:r>
           </w:p>
         </w:tc>
@@ -678,7 +322,7 @@
                 <w:color w:val="16202A"/>
                 <w:sz w:val="20"/>
               </w:rPr>
-              <w:t>Conversão de CSV ou TXT para arquivos XLSX.</w:t>
+              <w:t>CSV/TXT para XLSX, individualmente ou em lote.</w:t>
             </w:r>
           </w:p>
         </w:tc>
@@ -705,7 +349,7 @@
                 <w:color w:val="16202A"/>
                 <w:sz w:val="20"/>
               </w:rPr>
-              <w:t>Organização</w:t>
+              <w:t>Venda diária</w:t>
             </w:r>
           </w:p>
         </w:tc>
@@ -729,58 +373,7 @@
                 <w:color w:val="16202A"/>
                 <w:sz w:val="20"/>
               </w:rPr>
-              <w:t>Pesquisa, ordenação, favoritos, criação, renomeação e exclusão.</w:t>
-            </w:r>
-          </w:p>
-        </w:tc>
-      </w:tr>
-      <w:tr>
-        <w:tc>
-          <w:tcPr>
-            <w:tcW w:type="dxa" w:w="2520"/>
-            <w:shd w:fill="F4F6F8"/>
-            <w:tcMar>
-              <w:top w:w="90" w:type="dxa"/>
-              <w:start w:w="120" w:type="dxa"/>
-              <w:bottom w:w="90" w:type="dxa"/>
-              <w:end w:w="120" w:type="dxa"/>
-            </w:tcMar>
-            <w:vAlign w:val="center"/>
-          </w:tcPr>
-          <w:p>
-            <w:r>
-              <w:rPr>
-                <w:rFonts w:ascii="Calibri" w:hAnsi="Calibri"/>
-                <w:b/>
-                <w:i w:val="0"/>
-                <w:color w:val="16202A"/>
-                <w:sz w:val="20"/>
-              </w:rPr>
-              <w:t>Venda Diária</w:t>
-            </w:r>
-          </w:p>
-        </w:tc>
-        <w:tc>
-          <w:tcPr>
-            <w:tcW w:type="dxa" w:w="7056"/>
-            <w:tcMar>
-              <w:top w:w="90" w:type="dxa"/>
-              <w:start w:w="120" w:type="dxa"/>
-              <w:bottom w:w="90" w:type="dxa"/>
-              <w:end w:w="120" w:type="dxa"/>
-            </w:tcMar>
-            <w:vAlign w:val="center"/>
-          </w:tcPr>
-          <w:p>
-            <w:r>
-              <w:rPr>
-                <w:rFonts w:ascii="Calibri" w:hAnsi="Calibri"/>
-                <w:b w:val="0"/>
-                <w:i w:val="0"/>
-                <w:color w:val="16202A"/>
-                <w:sz w:val="20"/>
-              </w:rPr>
-              <w:t>Separação por dia, seleção mensal e geração de arquivo concatenado.</w:t>
+              <w:t>Seleção mensal, separação por dia e geração de concatenado.</w:t>
             </w:r>
           </w:p>
         </w:tc>
@@ -792,7 +385,7 @@
         <w:pStyle w:val="Heading1"/>
       </w:pPr>
       <w:r>
-        <w:t>2. Instalação e abertura</w:t>
+        <w:t>2. Instalação e SmartScreen</w:t>
       </w:r>
     </w:p>
     <w:p>
@@ -807,7 +400,7 @@
           <w:color w:val="16202A"/>
           <w:sz w:val="21"/>
         </w:rPr>
-        <w:t>Execute o instalador Mavi-SFTP-Setup fornecido pela equipe responsável.</w:t>
+        <w:t>Execute o instalador Mavi-SFTP-Setup e conclua a instalação.</w:t>
       </w:r>
     </w:p>
     <w:p>
@@ -822,90 +415,7 @@
           <w:color w:val="16202A"/>
           <w:sz w:val="21"/>
         </w:rPr>
-        <w:t>Escolha a pasta de instalação, quando solicitado, e conclua o assistente.</w:t>
-      </w:r>
-    </w:p>
-    <w:p>
-      <w:pPr>
-        <w:pStyle w:val="ListNumber"/>
-      </w:pPr>
-      <w:r>
-        <w:rPr>
-          <w:rFonts w:ascii="Calibri" w:hAnsi="Calibri"/>
-          <w:b w:val="0"/>
-          <w:i w:val="0"/>
-          <w:color w:val="16202A"/>
-          <w:sz w:val="21"/>
-        </w:rPr>
-        <w:t>Abra o programa pelo atalho da Área de Trabalho ou pelo menu Iniciar.</w:t>
-      </w:r>
-    </w:p>
-    <w:tbl>
-      <w:tblPr>
-        <w:tblW w:type="auto" w:w="0"/>
-        <w:jc w:val="center"/>
-        <w:tblLayout w:type="fixed"/>
-        <w:tblLook w:firstColumn="1" w:firstRow="1" w:lastColumn="0" w:lastRow="0" w:noHBand="0" w:noVBand="1" w:val="04A0"/>
-      </w:tblPr>
-      <w:tblGrid>
-        <w:gridCol w:w="9792"/>
-      </w:tblGrid>
-      <w:tr>
-        <w:tc>
-          <w:tcPr>
-            <w:tcW w:type="dxa" w:w="9576"/>
-            <w:shd w:fill="EAF8FB"/>
-            <w:tcMar>
-              <w:top w:w="120" w:type="dxa"/>
-              <w:start w:w="160" w:type="dxa"/>
-              <w:bottom w:w="120" w:type="dxa"/>
-              <w:end w:w="160" w:type="dxa"/>
-            </w:tcMar>
-          </w:tcPr>
-          <w:p>
-            <w:pPr>
-              <w:spacing w:after="0"/>
-            </w:pPr>
-            <w:r>
-              <w:rPr>
-                <w:rFonts w:ascii="Calibri" w:hAnsi="Calibri"/>
-                <w:b/>
-                <w:i w:val="0"/>
-                <w:color w:val="16202A"/>
-                <w:sz w:val="20"/>
-              </w:rPr>
-              <w:t xml:space="preserve">Importante: </w:t>
-            </w:r>
-            <w:r>
-              <w:rPr>
-                <w:rFonts w:ascii="Calibri" w:hAnsi="Calibri"/>
-                <w:b w:val="0"/>
-                <w:i w:val="0"/>
-                <w:color w:val="16202A"/>
-                <w:sz w:val="20"/>
-              </w:rPr>
-              <w:t>O instalador completo inclui os componentes usados pelo aplicativo. Não é necessário instalar Node.js, Electron ou Python separadamente.</w:t>
-            </w:r>
-          </w:p>
-        </w:tc>
-      </w:tr>
-    </w:tbl>
-    <w:p>
-      <w:pPr>
-        <w:spacing w:after="20"/>
-      </w:pPr>
-    </w:p>
-    <w:p>
-      <w:pPr>
-        <w:pStyle w:val="Heading2"/>
-      </w:pPr>
-      <w:r>
-        <w:t>2.1 Aviso do Microsoft Defender SmartScreen</w:t>
-      </w:r>
-    </w:p>
-    <w:p>
-      <w:r>
-        <w:t>Como o instalador atual ainda não possui uma assinatura digital reconhecida, o Windows pode exibir a mensagem “O Windows protegeu o computador” e informar que o Microsoft Defender SmartScreen impediu a execução de um aplicativo não reconhecido.</w:t>
+        <w:t>Abra o aplicativo pelo menu Iniciar ou atalho da Área de Trabalho.</w:t>
       </w:r>
     </w:p>
     <w:tbl>
@@ -942,7 +452,7 @@
                 <w:color w:val="A83232"/>
                 <w:sz w:val="20"/>
               </w:rPr>
-              <w:t xml:space="preserve">O que significa: </w:t>
+              <w:t xml:space="preserve">SmartScreen: </w:t>
             </w:r>
             <w:r>
               <w:rPr>
@@ -952,7 +462,7 @@
                 <w:color w:val="16202A"/>
                 <w:sz w:val="20"/>
               </w:rPr>
-              <w:t>Esse aviso indica que o Windows ainda não conseguiu confirmar a identidade do publicador ou estabelecer reputação para aquela versão do arquivo. Ele não significa, por si só, que um vírus foi detectado.</w:t>
+              <w:t>Enquanto o instalador não possuir assinatura digital reconhecida, o Windows pode mostrar “O Windows protegeu o computador”. Isso indica publicador sem reputação reconhecida e não significa, isoladamente, detecção de vírus.</w:t>
             </w:r>
           </w:p>
         </w:tc>
@@ -965,7 +475,15 @@
     </w:p>
     <w:p>
       <w:r>
-        <w:t>Prossiga somente quando o instalador tiver sido obtido na Release oficial do repositório do Mavi SFTP ou enviado diretamente por uma pessoa responsável pelo aplicativo.</w:t>
+        <w:t>Se o arquivo veio da Release oficial do Mavi SFTP ou da equipe responsável, clique em Mais informações e depois em Executar assim mesmo. Não prossiga se a origem do arquivo for desconhecida.</w:t>
+      </w:r>
+    </w:p>
+    <w:p>
+      <w:pPr>
+        <w:pStyle w:val="Heading1"/>
+      </w:pPr>
+      <w:r>
+        <w:t>3. Conexão e favoritos</w:t>
       </w:r>
     </w:p>
     <w:p>
@@ -980,7 +498,7 @@
           <w:color w:val="16202A"/>
           <w:sz w:val="21"/>
         </w:rPr>
-        <w:t>Na tela do SmartScreen, confirme que o arquivo aberto é o instalador esperado do Mavi SFTP.</w:t>
+        <w:t>Informe Host, Porta (normalmente 22), Usuário e Senha.</w:t>
       </w:r>
     </w:p>
     <w:p>
@@ -995,7 +513,7 @@
           <w:color w:val="16202A"/>
           <w:sz w:val="21"/>
         </w:rPr>
-        <w:t>Clique em Mais informações.</w:t>
+        <w:t>Clique em Conectar. Ao concluir, a pasta raiz (/) será aberta.</w:t>
       </w:r>
     </w:p>
     <w:p>
@@ -1010,12 +528,12 @@
           <w:color w:val="16202A"/>
           <w:sz w:val="21"/>
         </w:rPr>
-        <w:t>Verifique novamente o nome do aplicativo e a origem do arquivo.</w:t>
+        <w:t>Use Desconectar ao terminar ou antes de trocar de servidor.</w:t>
       </w:r>
     </w:p>
     <w:p>
       <w:pPr>
-        <w:pStyle w:val="ListNumber"/>
+        <w:pStyle w:val="ListBullet"/>
       </w:pPr>
       <w:r>
         <w:rPr>
@@ -1025,67 +543,22 @@
           <w:color w:val="16202A"/>
           <w:sz w:val="21"/>
         </w:rPr>
-        <w:t>Clique em Executar assim mesmo para iniciar a instalação.</w:t>
+        <w:t>Salvar conexão atual cria um favorito com host, porta e usuário; a senha não é armazenada.</w:t>
       </w:r>
     </w:p>
-    <w:tbl>
-      <w:tblPr>
-        <w:tblW w:type="auto" w:w="0"/>
-        <w:jc w:val="center"/>
-        <w:tblLayout w:type="fixed"/>
-        <w:tblLook w:firstColumn="1" w:firstRow="1" w:lastColumn="0" w:lastRow="0" w:noHBand="0" w:noVBand="1" w:val="04A0"/>
-      </w:tblPr>
-      <w:tblGrid>
-        <w:gridCol w:w="9792"/>
-      </w:tblGrid>
-      <w:tr>
-        <w:tc>
-          <w:tcPr>
-            <w:tcW w:type="dxa" w:w="9576"/>
-            <w:shd w:fill="FDEEEE"/>
-            <w:tcMar>
-              <w:top w:w="120" w:type="dxa"/>
-              <w:start w:w="160" w:type="dxa"/>
-              <w:bottom w:w="120" w:type="dxa"/>
-              <w:end w:w="160" w:type="dxa"/>
-            </w:tcMar>
-          </w:tcPr>
-          <w:p>
-            <w:pPr>
-              <w:spacing w:after="0"/>
-            </w:pPr>
-            <w:r>
-              <w:rPr>
-                <w:rFonts w:ascii="Calibri" w:hAnsi="Calibri"/>
-                <w:b/>
-                <w:i w:val="0"/>
-                <w:color w:val="A83232"/>
-                <w:sz w:val="20"/>
-              </w:rPr>
-              <w:t xml:space="preserve">Não prossiga: </w:t>
-            </w:r>
-            <w:r>
-              <w:rPr>
-                <w:rFonts w:ascii="Calibri" w:hAnsi="Calibri"/>
-                <w:b w:val="0"/>
-                <w:i w:val="0"/>
-                <w:color w:val="16202A"/>
-                <w:sz w:val="20"/>
-              </w:rPr>
-              <w:t>Se o arquivo veio de um link desconhecido, mensagem suspeita, site não oficial ou fonte que você não consegue confirmar, cancele a instalação e solicite um novo arquivo à equipe responsável.</w:t>
-            </w:r>
-          </w:p>
-        </w:tc>
-      </w:tr>
-    </w:tbl>
     <w:p>
       <w:pPr>
-        <w:spacing w:after="20"/>
+        <w:pStyle w:val="ListBullet"/>
       </w:pPr>
-    </w:p>
-    <w:p>
       <w:r>
-        <w:t>O aviso pode reaparecer em novas versões porque cada instalador possui um arquivo e um hash diferentes. A solução definitiva é assinar digitalmente o aplicativo com um certificado de assinatura de código confiável. Até que essa assinatura seja configurada, o aviso é esperado em computadores que ainda não reconhecem o instalador.</w:t>
+        <w:rPr>
+          <w:rFonts w:ascii="Calibri" w:hAnsi="Calibri"/>
+          <w:b w:val="0"/>
+          <w:i w:val="0"/>
+          <w:color w:val="16202A"/>
+          <w:sz w:val="21"/>
+        </w:rPr>
+        <w:t>Clique em um favorito para preencher os campos ou no X para removê-lo.</w:t>
       </w:r>
     </w:p>
     <w:p>
@@ -1093,7 +566,7 @@
         <w:pStyle w:val="Heading1"/>
       </w:pPr>
       <w:r>
-        <w:t>3. Conhecendo a interface</w:t>
+        <w:t>4. Navegação e arquivos</w:t>
       </w:r>
     </w:p>
     <w:tbl>
@@ -1185,7 +658,7 @@
                 <w:color w:val="16202A"/>
                 <w:sz w:val="20"/>
               </w:rPr>
-              <w:t>Barra superior</w:t>
+              <w:t>Abrir/voltar</w:t>
             </w:r>
           </w:p>
         </w:tc>
@@ -1209,7 +682,7 @@
                 <w:color w:val="16202A"/>
                 <w:sz w:val="20"/>
               </w:rPr>
-              <w:t>Exibe a marca, o estado da conexão e os botões minimizar, maximizar/restaurar e fechar.</w:t>
+              <w:t>Dê duplo clique em uma pasta; use ↑ para voltar.</w:t>
             </w:r>
           </w:p>
         </w:tc>
@@ -1236,7 +709,7 @@
                 <w:color w:val="16202A"/>
                 <w:sz w:val="20"/>
               </w:rPr>
-              <w:t>Conexão</w:t>
+              <w:t>Buscar</w:t>
             </w:r>
           </w:p>
         </w:tc>
@@ -1260,7 +733,7 @@
                 <w:color w:val="16202A"/>
                 <w:sz w:val="20"/>
               </w:rPr>
-              <w:t>Campos Host, Porta, Usuário e Senha, além de Conectar/Desconectar.</w:t>
+              <w:t>Filtra pelo nome dentro da pasta atual.</w:t>
             </w:r>
           </w:p>
         </w:tc>
@@ -1287,7 +760,7 @@
                 <w:color w:val="16202A"/>
                 <w:sz w:val="20"/>
               </w:rPr>
-              <w:t>Favoritos</w:t>
+              <w:t>Ordenar</w:t>
             </w:r>
           </w:p>
         </w:tc>
@@ -1311,7 +784,7 @@
                 <w:color w:val="16202A"/>
                 <w:sz w:val="20"/>
               </w:rPr>
-              <w:t>Lista conexões salvas e permite preencher rapidamente host, porta e usuário.</w:t>
+              <w:t>Clique em Nome, Tamanho ou Modificado; repita para inverter a ordem.</w:t>
             </w:r>
           </w:p>
         </w:tc>
@@ -1338,7 +811,7 @@
                 <w:color w:val="16202A"/>
                 <w:sz w:val="20"/>
               </w:rPr>
-              <w:t>Log</w:t>
+              <w:t>Atualizar</w:t>
             </w:r>
           </w:p>
         </w:tc>
@@ -1362,7 +835,7 @@
                 <w:color w:val="16202A"/>
                 <w:sz w:val="20"/>
               </w:rPr>
-              <w:t>Registra conexões, transferências, conversões, avisos e erros.</w:t>
+              <w:t>Recarrega a pasta atual.</w:t>
             </w:r>
           </w:p>
         </w:tc>
@@ -1389,7 +862,7 @@
                 <w:color w:val="16202A"/>
                 <w:sz w:val="20"/>
               </w:rPr>
-              <w:t>Barra de caminho</w:t>
+              <w:t>Recentes</w:t>
             </w:r>
           </w:p>
         </w:tc>
@@ -1413,7 +886,7 @@
                 <w:color w:val="16202A"/>
                 <w:sz w:val="20"/>
               </w:rPr>
-              <w:t>Mostra a pasta atual e reúne navegação, pesquisa e ações da pasta.</w:t>
+              <w:t>Na raiz, mostra até 30 arquivos mais recentes do servidor.</w:t>
             </w:r>
           </w:p>
         </w:tc>
@@ -1440,7 +913,7 @@
                 <w:color w:val="16202A"/>
                 <w:sz w:val="20"/>
               </w:rPr>
-              <w:t>Lista de arquivos</w:t>
+              <w:t>Upload/+ Pasta</w:t>
             </w:r>
           </w:p>
         </w:tc>
@@ -1464,7 +937,7 @@
                 <w:color w:val="16202A"/>
                 <w:sz w:val="20"/>
               </w:rPr>
-              <w:t>Exibe nome, tamanho, data de modificação e ações disponíveis.</w:t>
+              <w:t>Envia um arquivo ou cria uma subpasta no caminho atual.</w:t>
             </w:r>
           </w:p>
         </w:tc>
@@ -1491,7 +964,7 @@
                 <w:color w:val="16202A"/>
                 <w:sz w:val="20"/>
               </w:rPr>
-              <w:t>Progresso</w:t>
+              <w:t>ren/del</w:t>
             </w:r>
           </w:p>
         </w:tc>
@@ -1515,104 +988,13 @@
                 <w:color w:val="16202A"/>
                 <w:sz w:val="20"/>
               </w:rPr>
-              <w:t>Mostra percentual, quantidade processada, nome do arquivo e erros.</w:t>
+              <w:t>Renomeia ou exclui. Para excluir, digite exatamente o nome do item.</w:t>
             </w:r>
           </w:p>
         </w:tc>
       </w:tr>
     </w:tbl>
     <w:p/>
-    <w:p>
-      <w:pPr>
-        <w:pStyle w:val="Heading1"/>
-      </w:pPr>
-      <w:r>
-        <w:t>4. Conectar e desconectar</w:t>
-      </w:r>
-    </w:p>
-    <w:p>
-      <w:pPr>
-        <w:pStyle w:val="Heading2"/>
-      </w:pPr>
-      <w:r>
-        <w:t>4.1 Fazer uma conexão</w:t>
-      </w:r>
-    </w:p>
-    <w:p>
-      <w:pPr>
-        <w:pStyle w:val="ListNumber"/>
-      </w:pPr>
-      <w:r>
-        <w:rPr>
-          <w:rFonts w:ascii="Calibri" w:hAnsi="Calibri"/>
-          <w:b w:val="0"/>
-          <w:i w:val="0"/>
-          <w:color w:val="16202A"/>
-          <w:sz w:val="21"/>
-        </w:rPr>
-        <w:t>No campo Host, informe o endereço do servidor, sem incluir sftp://.</w:t>
-      </w:r>
-    </w:p>
-    <w:p>
-      <w:pPr>
-        <w:pStyle w:val="ListNumber"/>
-      </w:pPr>
-      <w:r>
-        <w:rPr>
-          <w:rFonts w:ascii="Calibri" w:hAnsi="Calibri"/>
-          <w:b w:val="0"/>
-          <w:i w:val="0"/>
-          <w:color w:val="16202A"/>
-          <w:sz w:val="21"/>
-        </w:rPr>
-        <w:t>Informe a Porta. O valor padrão de SFTP é 22.</w:t>
-      </w:r>
-    </w:p>
-    <w:p>
-      <w:pPr>
-        <w:pStyle w:val="ListNumber"/>
-      </w:pPr>
-      <w:r>
-        <w:rPr>
-          <w:rFonts w:ascii="Calibri" w:hAnsi="Calibri"/>
-          <w:b w:val="0"/>
-          <w:i w:val="0"/>
-          <w:color w:val="16202A"/>
-          <w:sz w:val="21"/>
-        </w:rPr>
-        <w:t>Preencha Usuário e Senha.</w:t>
-      </w:r>
-    </w:p>
-    <w:p>
-      <w:pPr>
-        <w:pStyle w:val="ListNumber"/>
-      </w:pPr>
-      <w:r>
-        <w:rPr>
-          <w:rFonts w:ascii="Calibri" w:hAnsi="Calibri"/>
-          <w:b w:val="0"/>
-          <w:i w:val="0"/>
-          <w:color w:val="16202A"/>
-          <w:sz w:val="21"/>
-        </w:rPr>
-        <w:t>Clique em Conectar ou pressione Enter em um dos campos.</w:t>
-      </w:r>
-    </w:p>
-    <w:p>
-      <w:pPr>
-        <w:pStyle w:val="ListNumber"/>
-      </w:pPr>
-      <w:r>
-        <w:rPr>
-          <w:rFonts w:ascii="Calibri" w:hAnsi="Calibri"/>
-          <w:b w:val="0"/>
-          <w:i w:val="0"/>
-          <w:color w:val="16202A"/>
-          <w:sz w:val="21"/>
-        </w:rPr>
-        <w:t>Aguarde a confirmação. Após conectar, o aplicativo abre a pasta raiz (/).</w:t>
-      </w:r>
-    </w:p>
     <w:tbl>
       <w:tblPr>
         <w:tblW w:type="auto" w:w="0"/>
@@ -1627,7 +1009,7 @@
         <w:tc>
           <w:tcPr>
             <w:tcW w:type="dxa" w:w="9576"/>
-            <w:shd w:fill="EAF8FB"/>
+            <w:shd w:fill="FDEEEE"/>
             <w:tcMar>
               <w:top w:w="120" w:type="dxa"/>
               <w:start w:w="160" w:type="dxa"/>
@@ -1644,10 +1026,10 @@
                 <w:rFonts w:ascii="Calibri" w:hAnsi="Calibri"/>
                 <w:b/>
                 <w:i w:val="0"/>
-                <w:color w:val="16202A"/>
+                <w:color w:val="A83232"/>
                 <w:sz w:val="20"/>
               </w:rPr>
-              <w:t xml:space="preserve">Validação: </w:t>
+              <w:t xml:space="preserve">Atenção: </w:t>
             </w:r>
             <w:r>
               <w:rPr>
@@ -1657,7 +1039,7 @@
                 <w:color w:val="16202A"/>
                 <w:sz w:val="20"/>
               </w:rPr>
-              <w:t>Host e usuário são obrigatórios. O tempo máximo inicial de resposta do servidor é de aproximadamente 10 segundos.</w:t>
+              <w:t>A exclusão ocorre diretamente no servidor e não possui lixeira. Pastas podem ser removidas com todo o conteúdo.</w:t>
             </w:r>
           </w:p>
         </w:tc>
@@ -1670,10 +1052,10 @@
     </w:p>
     <w:p>
       <w:pPr>
-        <w:pStyle w:val="Heading2"/>
+        <w:pStyle w:val="Heading1"/>
       </w:pPr>
       <w:r>
-        <w:t>4.2 Identificar o estado</w:t>
+        <w:t>5. Downloads e conversão</w:t>
       </w:r>
     </w:p>
     <w:p>
@@ -1688,7 +1070,7 @@
           <w:color w:val="16202A"/>
           <w:sz w:val="21"/>
         </w:rPr>
-        <w:t>Desconectado: a área principal mostra que não há conexão ativa.</w:t>
+        <w:t>down: baixa um arquivo no formato original.</w:t>
       </w:r>
     </w:p>
     <w:p>
@@ -1703,144 +1085,7 @@
           <w:color w:val="16202A"/>
           <w:sz w:val="21"/>
         </w:rPr>
-        <w:t>Conectado: a barra superior exibe usuário@host e o navegador de arquivos fica disponível.</w:t>
-      </w:r>
-    </w:p>
-    <w:p>
-      <w:pPr>
-        <w:pStyle w:val="Heading2"/>
-      </w:pPr>
-      <w:r>
-        <w:t>4.3 Desconectar</w:t>
-      </w:r>
-    </w:p>
-    <w:p>
-      <w:r>
-        <w:t>Clique em Desconectar antes de trocar de servidor ou encerrar uma sessão. Ao fechar o aplicativo, a conexão ativa também é finalizada.</w:t>
-      </w:r>
-    </w:p>
-    <w:p>
-      <w:pPr>
-        <w:pStyle w:val="Heading1"/>
-      </w:pPr>
-      <w:r>
-        <w:t>5. Favoritos</w:t>
-      </w:r>
-    </w:p>
-    <w:p>
-      <w:pPr>
-        <w:pStyle w:val="Heading2"/>
-      </w:pPr>
-      <w:r>
-        <w:t>5.1 Salvar</w:t>
-      </w:r>
-    </w:p>
-    <w:p>
-      <w:pPr>
-        <w:pStyle w:val="ListNumber"/>
-      </w:pPr>
-      <w:r>
-        <w:rPr>
-          <w:rFonts w:ascii="Calibri" w:hAnsi="Calibri"/>
-          <w:b w:val="0"/>
-          <w:i w:val="0"/>
-          <w:color w:val="16202A"/>
-          <w:sz w:val="21"/>
-        </w:rPr>
-        <w:t>Conecte-se ao servidor desejado.</w:t>
-      </w:r>
-    </w:p>
-    <w:p>
-      <w:pPr>
-        <w:pStyle w:val="ListNumber"/>
-      </w:pPr>
-      <w:r>
-        <w:rPr>
-          <w:rFonts w:ascii="Calibri" w:hAnsi="Calibri"/>
-          <w:b w:val="0"/>
-          <w:i w:val="0"/>
-          <w:color w:val="16202A"/>
-          <w:sz w:val="21"/>
-        </w:rPr>
-        <w:t>Clique em + Salvar conexão atual.</w:t>
-      </w:r>
-    </w:p>
-    <w:p>
-      <w:pPr>
-        <w:pStyle w:val="ListNumber"/>
-      </w:pPr>
-      <w:r>
-        <w:rPr>
-          <w:rFonts w:ascii="Calibri" w:hAnsi="Calibri"/>
-          <w:b w:val="0"/>
-          <w:i w:val="0"/>
-          <w:color w:val="16202A"/>
-          <w:sz w:val="21"/>
-        </w:rPr>
-        <w:t>Digite um nome que identifique a conexão e confirme.</w:t>
-      </w:r>
-    </w:p>
-    <w:tbl>
-      <w:tblPr>
-        <w:tblW w:type="auto" w:w="0"/>
-        <w:jc w:val="center"/>
-        <w:tblLayout w:type="fixed"/>
-        <w:tblLook w:firstColumn="1" w:firstRow="1" w:lastColumn="0" w:lastRow="0" w:noHBand="0" w:noVBand="1" w:val="04A0"/>
-      </w:tblPr>
-      <w:tblGrid>
-        <w:gridCol w:w="9792"/>
-      </w:tblGrid>
-      <w:tr>
-        <w:tc>
-          <w:tcPr>
-            <w:tcW w:type="dxa" w:w="9576"/>
-            <w:shd w:fill="EAF8FB"/>
-            <w:tcMar>
-              <w:top w:w="120" w:type="dxa"/>
-              <w:start w:w="160" w:type="dxa"/>
-              <w:bottom w:w="120" w:type="dxa"/>
-              <w:end w:w="160" w:type="dxa"/>
-            </w:tcMar>
-          </w:tcPr>
-          <w:p>
-            <w:pPr>
-              <w:spacing w:after="0"/>
-            </w:pPr>
-            <w:r>
-              <w:rPr>
-                <w:rFonts w:ascii="Calibri" w:hAnsi="Calibri"/>
-                <w:b/>
-                <w:i w:val="0"/>
-                <w:color w:val="16202A"/>
-                <w:sz w:val="20"/>
-              </w:rPr>
-              <w:t xml:space="preserve">Privacidade: </w:t>
-            </w:r>
-            <w:r>
-              <w:rPr>
-                <w:rFonts w:ascii="Calibri" w:hAnsi="Calibri"/>
-                <w:b w:val="0"/>
-                <w:i w:val="0"/>
-                <w:color w:val="16202A"/>
-                <w:sz w:val="20"/>
-              </w:rPr>
-              <w:t>O favorito guarda apenas nome, host, porta e usuário no computador. A senha não é salva.</w:t>
-            </w:r>
-          </w:p>
-        </w:tc>
-      </w:tr>
-    </w:tbl>
-    <w:p>
-      <w:pPr>
-        <w:spacing w:after="20"/>
-      </w:pPr>
-    </w:p>
-    <w:p>
-      <w:pPr>
-        <w:pStyle w:val="Heading2"/>
-      </w:pPr>
-      <w:r>
-        <w:t>5.2 Usar ou remover</w:t>
+        <w:t>xlsx: converte um CSV/TXT individual para Excel.</w:t>
       </w:r>
     </w:p>
     <w:p>
@@ -1855,308 +1100,12 @@
           <w:color w:val="16202A"/>
           <w:sz w:val="21"/>
         </w:rPr>
-        <w:t>Clique no nome do favorito para preencher Host, Porta e Usuário; depois informe a senha e conecte.</w:t>
-      </w:r>
-    </w:p>
-    <w:p>
-      <w:pPr>
-        <w:pStyle w:val="ListBullet"/>
-      </w:pPr>
-      <w:r>
-        <w:rPr>
-          <w:rFonts w:ascii="Calibri" w:hAnsi="Calibri"/>
-          <w:b w:val="0"/>
-          <w:i w:val="0"/>
-          <w:color w:val="16202A"/>
-          <w:sz w:val="21"/>
-        </w:rPr>
-        <w:t>Clique no X ao lado do favorito para removê-lo.</w:t>
-      </w:r>
-    </w:p>
-    <w:p>
-      <w:pPr>
-        <w:pStyle w:val="Heading1"/>
-      </w:pPr>
-      <w:r>
-        <w:t>6. Navegar, pesquisar e ordenar</w:t>
-      </w:r>
-    </w:p>
-    <w:p>
-      <w:pPr>
-        <w:pStyle w:val="Heading2"/>
-      </w:pPr>
-      <w:r>
-        <w:t>6.1 Navegação</w:t>
-      </w:r>
-    </w:p>
-    <w:p>
-      <w:pPr>
-        <w:pStyle w:val="ListBullet"/>
-      </w:pPr>
-      <w:r>
-        <w:rPr>
-          <w:rFonts w:ascii="Calibri" w:hAnsi="Calibri"/>
-          <w:b w:val="0"/>
-          <w:i w:val="0"/>
-          <w:color w:val="16202A"/>
-          <w:sz w:val="21"/>
-        </w:rPr>
-        <w:t>Abra uma pasta com duplo clique.</w:t>
-      </w:r>
-    </w:p>
-    <w:p>
-      <w:pPr>
-        <w:pStyle w:val="ListBullet"/>
-      </w:pPr>
-      <w:r>
-        <w:rPr>
-          <w:rFonts w:ascii="Calibri" w:hAnsi="Calibri"/>
-          <w:b w:val="0"/>
-          <w:i w:val="0"/>
-          <w:color w:val="16202A"/>
-          <w:sz w:val="21"/>
-        </w:rPr>
-        <w:t>Use a seta para cima para retornar à pasta anterior.</w:t>
-      </w:r>
-    </w:p>
-    <w:p>
-      <w:pPr>
-        <w:pStyle w:val="ListBullet"/>
-      </w:pPr>
-      <w:r>
-        <w:rPr>
-          <w:rFonts w:ascii="Calibri" w:hAnsi="Calibri"/>
-          <w:b w:val="0"/>
-          <w:i w:val="0"/>
-          <w:color w:val="16202A"/>
-          <w:sz w:val="21"/>
-        </w:rPr>
-        <w:t>Consulte o caminho completo na barra de caminho.</w:t>
-      </w:r>
-    </w:p>
-    <w:p>
-      <w:pPr>
-        <w:pStyle w:val="ListBullet"/>
-      </w:pPr>
-      <w:r>
-        <w:rPr>
-          <w:rFonts w:ascii="Calibri" w:hAnsi="Calibri"/>
-          <w:b w:val="0"/>
-          <w:i w:val="0"/>
-          <w:color w:val="16202A"/>
-          <w:sz w:val="21"/>
-        </w:rPr>
-        <w:t>Clique em Atualizar para recarregar a pasta atual.</w:t>
-      </w:r>
-    </w:p>
-    <w:p>
-      <w:pPr>
-        <w:pStyle w:val="Heading2"/>
-      </w:pPr>
-      <w:r>
-        <w:t>6.2 Arquivos recentes</w:t>
+        <w:t>CSV, xlsx e Ambos: processam os arquivos compatíveis de uma pasta.</w:t>
       </w:r>
     </w:p>
     <w:p>
       <w:r>
-        <w:t>Na pasta raiz, a seção Recentes lista até 30 arquivos do servidor, ordenados pela data de modificação mais recente. O caminho completo aparece no nome para indicar onde cada arquivo está armazenado.</w:t>
-      </w:r>
-    </w:p>
-    <w:p>
-      <w:pPr>
-        <w:pStyle w:val="Heading2"/>
-      </w:pPr>
-      <w:r>
-        <w:t>6.3 Pesquisa e ordenação</w:t>
-      </w:r>
-    </w:p>
-    <w:p>
-      <w:pPr>
-        <w:pStyle w:val="ListBullet"/>
-      </w:pPr>
-      <w:r>
-        <w:rPr>
-          <w:rFonts w:ascii="Calibri" w:hAnsi="Calibri"/>
-          <w:b w:val="0"/>
-          <w:i w:val="0"/>
-          <w:color w:val="16202A"/>
-          <w:sz w:val="21"/>
-        </w:rPr>
-        <w:t>Digite no campo Buscar arquivo para filtrar os itens da pasta atual pelo nome.</w:t>
-      </w:r>
-    </w:p>
-    <w:p>
-      <w:pPr>
-        <w:pStyle w:val="ListBullet"/>
-      </w:pPr>
-      <w:r>
-        <w:rPr>
-          <w:rFonts w:ascii="Calibri" w:hAnsi="Calibri"/>
-          <w:b w:val="0"/>
-          <w:i w:val="0"/>
-          <w:color w:val="16202A"/>
-          <w:sz w:val="21"/>
-        </w:rPr>
-        <w:t>Clique em Nome, Tamanho ou Modificado para ordenar.</w:t>
-      </w:r>
-    </w:p>
-    <w:p>
-      <w:pPr>
-        <w:pStyle w:val="ListBullet"/>
-      </w:pPr>
-      <w:r>
-        <w:rPr>
-          <w:rFonts w:ascii="Calibri" w:hAnsi="Calibri"/>
-          <w:b w:val="0"/>
-          <w:i w:val="0"/>
-          <w:color w:val="16202A"/>
-          <w:sz w:val="21"/>
-        </w:rPr>
-        <w:t>Clique novamente no mesmo cabeçalho para alternar entre crescente e decrescente.</w:t>
-      </w:r>
-    </w:p>
-    <w:p>
-      <w:pPr>
-        <w:pStyle w:val="ListBullet"/>
-      </w:pPr>
-      <w:r>
-        <w:rPr>
-          <w:rFonts w:ascii="Calibri" w:hAnsi="Calibri"/>
-          <w:b w:val="0"/>
-          <w:i w:val="0"/>
-          <w:color w:val="16202A"/>
-          <w:sz w:val="21"/>
-        </w:rPr>
-        <w:t>As pastas permanecem antes dos arquivos, independentemente da ordenação escolhida.</w:t>
-      </w:r>
-    </w:p>
-    <w:p>
-      <w:pPr>
-        <w:pStyle w:val="Heading1"/>
-      </w:pPr>
-      <w:r>
-        <w:t>7. Download de arquivos</w:t>
-      </w:r>
-    </w:p>
-    <w:p>
-      <w:pPr>
-        <w:pStyle w:val="Heading2"/>
-      </w:pPr>
-      <w:r>
-        <w:t>7.1 Baixar no formato original</w:t>
-      </w:r>
-    </w:p>
-    <w:p>
-      <w:pPr>
-        <w:pStyle w:val="ListNumber"/>
-      </w:pPr>
-      <w:r>
-        <w:rPr>
-          <w:rFonts w:ascii="Calibri" w:hAnsi="Calibri"/>
-          <w:b w:val="0"/>
-          <w:i w:val="0"/>
-          <w:color w:val="16202A"/>
-          <w:sz w:val="21"/>
-        </w:rPr>
-        <w:t>Localize o arquivo desejado.</w:t>
-      </w:r>
-    </w:p>
-    <w:p>
-      <w:pPr>
-        <w:pStyle w:val="ListNumber"/>
-      </w:pPr>
-      <w:r>
-        <w:rPr>
-          <w:rFonts w:ascii="Calibri" w:hAnsi="Calibri"/>
-          <w:b w:val="0"/>
-          <w:i w:val="0"/>
-          <w:color w:val="16202A"/>
-          <w:sz w:val="21"/>
-        </w:rPr>
-        <w:t>Clique em down na linha do arquivo.</w:t>
-      </w:r>
-    </w:p>
-    <w:p>
-      <w:pPr>
-        <w:pStyle w:val="ListNumber"/>
-      </w:pPr>
-      <w:r>
-        <w:rPr>
-          <w:rFonts w:ascii="Calibri" w:hAnsi="Calibri"/>
-          <w:b w:val="0"/>
-          <w:i w:val="0"/>
-          <w:color w:val="16202A"/>
-          <w:sz w:val="21"/>
-        </w:rPr>
-        <w:t>Escolha o nome e o local de destino no computador.</w:t>
-      </w:r>
-    </w:p>
-    <w:p>
-      <w:pPr>
-        <w:pStyle w:val="ListNumber"/>
-      </w:pPr>
-      <w:r>
-        <w:rPr>
-          <w:rFonts w:ascii="Calibri" w:hAnsi="Calibri"/>
-          <w:b w:val="0"/>
-          <w:i w:val="0"/>
-          <w:color w:val="16202A"/>
-          <w:sz w:val="21"/>
-        </w:rPr>
-        <w:t>Acompanhe o progresso e aguarde a mensagem de conclusão.</w:t>
-      </w:r>
-    </w:p>
-    <w:p>
-      <w:pPr>
-        <w:pStyle w:val="Heading2"/>
-      </w:pPr>
-      <w:r>
-        <w:t>7.2 Baixar CSV/TXT como Excel</w:t>
-      </w:r>
-    </w:p>
-    <w:p>
-      <w:pPr>
-        <w:pStyle w:val="ListNumber"/>
-      </w:pPr>
-      <w:r>
-        <w:rPr>
-          <w:rFonts w:ascii="Calibri" w:hAnsi="Calibri"/>
-          <w:b w:val="0"/>
-          <w:i w:val="0"/>
-          <w:color w:val="16202A"/>
-          <w:sz w:val="21"/>
-        </w:rPr>
-        <w:t>Em um arquivo CSV ou TXT, clique em xlsx.</w:t>
-      </w:r>
-    </w:p>
-    <w:p>
-      <w:pPr>
-        <w:pStyle w:val="ListNumber"/>
-      </w:pPr>
-      <w:r>
-        <w:rPr>
-          <w:rFonts w:ascii="Calibri" w:hAnsi="Calibri"/>
-          <w:b w:val="0"/>
-          <w:i w:val="0"/>
-          <w:color w:val="16202A"/>
-          <w:sz w:val="21"/>
-        </w:rPr>
-        <w:t>Escolha onde salvar o arquivo .xlsx.</w:t>
-      </w:r>
-    </w:p>
-    <w:p>
-      <w:pPr>
-        <w:pStyle w:val="ListNumber"/>
-      </w:pPr>
-      <w:r>
-        <w:rPr>
-          <w:rFonts w:ascii="Calibri" w:hAnsi="Calibri"/>
-          <w:b w:val="0"/>
-          <w:i w:val="0"/>
-          <w:color w:val="16202A"/>
-          <w:sz w:val="21"/>
-        </w:rPr>
-        <w:t>Aguarde a conversão e confira os avisos no Log.</w:t>
+        <w:t>No download em lote, escolha Todos Arquivos, um período MM/AAAA identificado no nome dos arquivos ou Venda Diária. Depois selecione a pasta local e acompanhe a barra de progresso e o Log.</w:t>
       </w:r>
     </w:p>
     <w:tbl>
@@ -2203,7 +1152,7 @@
                 <w:color w:val="16202A"/>
                 <w:sz w:val="20"/>
               </w:rPr>
-              <w:t>O aplicativo detecta codificação UTF-8 ou Latin-1 e separadores como ponto e vírgula, vírgula, tabulação e barra vertical. Colunas identificadoras, como código, EAN, CPF e CNPJ, são preservadas como texto.</w:t>
+              <w:t>O aplicativo detecta UTF-8/Latin-1 e separadores comuns. Colunas identificadoras como código, EAN, CPF e CNPJ são preservadas como texto. Bases muito grandes podem gerar mais de um XLSX.</w:t>
             </w:r>
           </w:p>
         </w:tc>
@@ -2213,6 +1162,62 @@
       <w:pPr>
         <w:spacing w:after="20"/>
       </w:pPr>
+    </w:p>
+    <w:p>
+      <w:pPr>
+        <w:pStyle w:val="Heading1"/>
+      </w:pPr>
+      <w:r>
+        <w:t>6. Tratamento de bases de Venda Diária</w:t>
+      </w:r>
+    </w:p>
+    <w:p>
+      <w:r>
+        <w:t>Este fluxo é diferente do download mensal comum. Ele reúne as fontes necessárias, lê os registros, separa o conteúdo por data comercial e produz arquivos finais diários e um consolidado mensal.</w:t>
+      </w:r>
+    </w:p>
+    <w:p>
+      <w:pPr>
+        <w:pStyle w:val="Heading2"/>
+      </w:pPr>
+      <w:r>
+        <w:t>6.1 Arquivos reconhecidos</w:t>
+      </w:r>
+    </w:p>
+    <w:p>
+      <w:r>
+        <w:t>O modo aparece quando a pasta contém arquivos com um dos padrões abaixo, com data AAAAMMDD e extensão CSV/TXT opcional:</w:t>
+      </w:r>
+    </w:p>
+    <w:p>
+      <w:pPr>
+        <w:pStyle w:val="ListBullet"/>
+      </w:pPr>
+      <w:r>
+        <w:rPr>
+          <w:rFonts w:ascii="Calibri" w:hAnsi="Calibri"/>
+          <w:b w:val="0"/>
+          <w:i w:val="0"/>
+          <w:color w:val="16202A"/>
+          <w:sz w:val="21"/>
+        </w:rPr>
+        <w:t>BR_VENTAS_AAAAMMDD</w:t>
+      </w:r>
+    </w:p>
+    <w:p>
+      <w:pPr>
+        <w:pStyle w:val="ListBullet"/>
+      </w:pPr>
+      <w:r>
+        <w:rPr>
+          <w:rFonts w:ascii="Calibri" w:hAnsi="Calibri"/>
+          <w:b w:val="0"/>
+          <w:i w:val="0"/>
+          <w:color w:val="16202A"/>
+          <w:sz w:val="21"/>
+        </w:rPr>
+        <w:t>BR_VENDAS_DIARIA_COCACOLA_GPA_ENERGETICOS_SEM_CONCORRENCIA_AAAAMMDD</w:t>
+      </w:r>
     </w:p>
     <w:tbl>
       <w:tblPr>
@@ -2248,7 +1253,7 @@
                 <w:color w:val="16202A"/>
                 <w:sz w:val="20"/>
               </w:rPr>
-              <w:t xml:space="preserve">Planilhas grandes: </w:t>
+              <w:t xml:space="preserve">Exemplo: </w:t>
             </w:r>
             <w:r>
               <w:rPr>
@@ -2258,7 +1263,7 @@
                 <w:color w:val="16202A"/>
                 <w:sz w:val="20"/>
               </w:rPr>
-              <w:t>Uma base muito grande pode ser dividida em mais de um arquivo Excel para respeitar limites seguros de linhas.</w:t>
+              <w:t>BR_VENTAS_20260630.csv representa uma fonte datada de 30/06/2026.</w:t>
             </w:r>
           </w:p>
         </w:tc>
@@ -2271,15 +1276,367 @@
     </w:p>
     <w:p>
       <w:pPr>
-        <w:pStyle w:val="Heading1"/>
+        <w:pStyle w:val="Heading2"/>
       </w:pPr>
       <w:r>
-        <w:t>8. Download e conversão de pastas</w:t>
+        <w:t>6.2 Como iniciar</w:t>
+      </w:r>
+    </w:p>
+    <w:p>
+      <w:pPr>
+        <w:pStyle w:val="ListNumber"/>
+      </w:pPr>
+      <w:r>
+        <w:rPr>
+          <w:rFonts w:ascii="Calibri" w:hAnsi="Calibri"/>
+          <w:b w:val="0"/>
+          <w:i w:val="0"/>
+          <w:color w:val="16202A"/>
+          <w:sz w:val="21"/>
+        </w:rPr>
+        <w:t>Abra a pasta que contém as bases.</w:t>
+      </w:r>
+    </w:p>
+    <w:p>
+      <w:pPr>
+        <w:pStyle w:val="ListNumber"/>
+      </w:pPr>
+      <w:r>
+        <w:rPr>
+          <w:rFonts w:ascii="Calibri" w:hAnsi="Calibri"/>
+          <w:b w:val="0"/>
+          <w:i w:val="0"/>
+          <w:color w:val="16202A"/>
+          <w:sz w:val="21"/>
+        </w:rPr>
+        <w:t>Clique em CSV, xlsx ou Ambos na barra da pasta ou na linha da pasta desejada.</w:t>
+      </w:r>
+    </w:p>
+    <w:p>
+      <w:pPr>
+        <w:pStyle w:val="ListNumber"/>
+      </w:pPr>
+      <w:r>
+        <w:rPr>
+          <w:rFonts w:ascii="Calibri" w:hAnsi="Calibri"/>
+          <w:b w:val="0"/>
+          <w:i w:val="0"/>
+          <w:color w:val="16202A"/>
+          <w:sz w:val="21"/>
+        </w:rPr>
+        <w:t>Na janela Escolher download, selecione Baixar Venda Diária do mês MM/AAAA.</w:t>
+      </w:r>
+    </w:p>
+    <w:p>
+      <w:pPr>
+        <w:pStyle w:val="ListNumber"/>
+      </w:pPr>
+      <w:r>
+        <w:rPr>
+          <w:rFonts w:ascii="Calibri" w:hAnsi="Calibri"/>
+          <w:b w:val="0"/>
+          <w:i w:val="0"/>
+          <w:color w:val="16202A"/>
+          <w:sz w:val="21"/>
+        </w:rPr>
+        <w:t>Escolha a pasta local de destino e aguarde todas as etapas terminarem.</w:t>
+      </w:r>
+    </w:p>
+    <w:p>
+      <w:pPr>
+        <w:pStyle w:val="Heading2"/>
+      </w:pPr>
+      <w:r>
+        <w:t>6.3 Intervalo de fontes</w:t>
       </w:r>
     </w:p>
     <w:p>
       <w:r>
-        <w:t>O download em lote pode ser iniciado pelos botões da barra superior da pasta atual ou pelos botões csv, xlsx e ambos exibidos em uma pasta que contém arquivos compatíveis.</w:t>
+        <w:t>Para montar um mês, o aplicativo considera fontes datadas entre o primeiro dia desse mês e dez dias após seu último dia. Essa margem permite capturar bases posteriores que ainda contenham registros comerciais do mês solicitado.</w:t>
+      </w:r>
+    </w:p>
+    <w:tbl>
+      <w:tblPr>
+        <w:tblW w:type="auto" w:w="0"/>
+        <w:jc w:val="center"/>
+        <w:tblLayout w:type="fixed"/>
+        <w:tblLook w:firstColumn="1" w:firstRow="1" w:lastColumn="0" w:lastRow="0" w:noHBand="0" w:noVBand="1" w:val="04A0"/>
+      </w:tblPr>
+      <w:tblGrid>
+        <w:gridCol w:w="9792"/>
+      </w:tblGrid>
+      <w:tr>
+        <w:tc>
+          <w:tcPr>
+            <w:tcW w:type="dxa" w:w="9576"/>
+            <w:shd w:fill="EAF8FB"/>
+            <w:tcMar>
+              <w:top w:w="120" w:type="dxa"/>
+              <w:start w:w="160" w:type="dxa"/>
+              <w:bottom w:w="120" w:type="dxa"/>
+              <w:end w:w="160" w:type="dxa"/>
+            </w:tcMar>
+          </w:tcPr>
+          <w:p>
+            <w:pPr>
+              <w:spacing w:after="0"/>
+            </w:pPr>
+            <w:r>
+              <w:rPr>
+                <w:rFonts w:ascii="Calibri" w:hAnsi="Calibri"/>
+                <w:b/>
+                <w:i w:val="0"/>
+                <w:color w:val="16202A"/>
+                <w:sz w:val="20"/>
+              </w:rPr>
+              <w:t xml:space="preserve">Exemplo: </w:t>
+            </w:r>
+            <w:r>
+              <w:rPr>
+                <w:rFonts w:ascii="Calibri" w:hAnsi="Calibri"/>
+                <w:b w:val="0"/>
+                <w:i w:val="0"/>
+                <w:color w:val="16202A"/>
+                <w:sz w:val="20"/>
+              </w:rPr>
+              <w:t>Para junho/2026, são consideradas fontes de 01/06/2026 até 10/07/2026. Isso não significa que registros de julho entrarão no resultado; o filtro interno continuará aceitando somente datas comerciais iniciadas por 202606.</w:t>
+            </w:r>
+          </w:p>
+        </w:tc>
+      </w:tr>
+    </w:tbl>
+    <w:p>
+      <w:pPr>
+        <w:spacing w:after="20"/>
+      </w:pPr>
+    </w:p>
+    <w:p>
+      <w:pPr>
+        <w:pStyle w:val="Heading2"/>
+      </w:pPr>
+      <w:r>
+        <w:t>6.4 Leitura e separação dos registros</w:t>
+      </w:r>
+    </w:p>
+    <w:p>
+      <w:pPr>
+        <w:pStyle w:val="ListBullet"/>
+      </w:pPr>
+      <w:r>
+        <w:rPr>
+          <w:rFonts w:ascii="Calibri" w:hAnsi="Calibri"/>
+          <w:b w:val="0"/>
+          <w:i w:val="0"/>
+          <w:color w:val="16202A"/>
+          <w:sz w:val="21"/>
+        </w:rPr>
+        <w:t>A codificação é detectada como UTF-8 ou Latin-1.</w:t>
+      </w:r>
+    </w:p>
+    <w:p>
+      <w:pPr>
+        <w:pStyle w:val="ListBullet"/>
+      </w:pPr>
+      <w:r>
+        <w:rPr>
+          <w:rFonts w:ascii="Calibri" w:hAnsi="Calibri"/>
+          <w:b w:val="0"/>
+          <w:i w:val="0"/>
+          <w:color w:val="16202A"/>
+          <w:sz w:val="21"/>
+        </w:rPr>
+        <w:t>O separador é detectado entre ponto e vírgula, vírgula, tabulação e barra vertical.</w:t>
+      </w:r>
+    </w:p>
+    <w:p>
+      <w:pPr>
+        <w:pStyle w:val="ListBullet"/>
+      </w:pPr>
+      <w:r>
+        <w:rPr>
+          <w:rFonts w:ascii="Calibri" w:hAnsi="Calibri"/>
+          <w:b w:val="0"/>
+          <w:i w:val="0"/>
+          <w:color w:val="16202A"/>
+          <w:sz w:val="21"/>
+        </w:rPr>
+        <w:t>A coluna obrigatória é FECHA_COMERCIAL.</w:t>
+      </w:r>
+    </w:p>
+    <w:p>
+      <w:pPr>
+        <w:pStyle w:val="ListBullet"/>
+      </w:pPr>
+      <w:r>
+        <w:rPr>
+          <w:rFonts w:ascii="Calibri" w:hAnsi="Calibri"/>
+          <w:b w:val="0"/>
+          <w:i w:val="0"/>
+          <w:color w:val="16202A"/>
+          <w:sz w:val="21"/>
+        </w:rPr>
+        <w:t>Cada valor válido deve ter oito dígitos no padrão AAAAMMDD.</w:t>
+      </w:r>
+    </w:p>
+    <w:p>
+      <w:pPr>
+        <w:pStyle w:val="ListBullet"/>
+      </w:pPr>
+      <w:r>
+        <w:rPr>
+          <w:rFonts w:ascii="Calibri" w:hAnsi="Calibri"/>
+          <w:b w:val="0"/>
+          <w:i w:val="0"/>
+          <w:color w:val="16202A"/>
+          <w:sz w:val="21"/>
+        </w:rPr>
+        <w:t>Somente linhas cuja FECHA_COMERCIAL começa com o período solicitado são mantidas.</w:t>
+      </w:r>
+    </w:p>
+    <w:p>
+      <w:pPr>
+        <w:pStyle w:val="ListBullet"/>
+      </w:pPr>
+      <w:r>
+        <w:rPr>
+          <w:rFonts w:ascii="Calibri" w:hAnsi="Calibri"/>
+          <w:b w:val="0"/>
+          <w:i w:val="0"/>
+          <w:color w:val="16202A"/>
+          <w:sz w:val="21"/>
+        </w:rPr>
+        <w:t>Cada dia encontrado é gravado em um CSV temporário separado, preservando cabeçalho e separador da fonte.</w:t>
+      </w:r>
+    </w:p>
+    <w:tbl>
+      <w:tblPr>
+        <w:tblW w:type="auto" w:w="0"/>
+        <w:jc w:val="center"/>
+        <w:tblLayout w:type="fixed"/>
+        <w:tblLook w:firstColumn="1" w:firstRow="1" w:lastColumn="0" w:lastRow="0" w:noHBand="0" w:noVBand="1" w:val="04A0"/>
+      </w:tblPr>
+      <w:tblGrid>
+        <w:gridCol w:w="9792"/>
+      </w:tblGrid>
+      <w:tr>
+        <w:tc>
+          <w:tcPr>
+            <w:tcW w:type="dxa" w:w="9576"/>
+            <w:shd w:fill="FDEEEE"/>
+            <w:tcMar>
+              <w:top w:w="120" w:type="dxa"/>
+              <w:start w:w="160" w:type="dxa"/>
+              <w:bottom w:w="120" w:type="dxa"/>
+              <w:end w:w="160" w:type="dxa"/>
+            </w:tcMar>
+          </w:tcPr>
+          <w:p>
+            <w:pPr>
+              <w:spacing w:after="0"/>
+            </w:pPr>
+            <w:r>
+              <w:rPr>
+                <w:rFonts w:ascii="Calibri" w:hAnsi="Calibri"/>
+                <w:b/>
+                <w:i w:val="0"/>
+                <w:color w:val="A83232"/>
+                <w:sz w:val="20"/>
+              </w:rPr>
+              <w:t xml:space="preserve">Erro obrigatório: </w:t>
+            </w:r>
+            <w:r>
+              <w:rPr>
+                <w:rFonts w:ascii="Calibri" w:hAnsi="Calibri"/>
+                <w:b w:val="0"/>
+                <w:i w:val="0"/>
+                <w:color w:val="16202A"/>
+                <w:sz w:val="20"/>
+              </w:rPr>
+              <w:t>Se FECHA_COMERCIAL não existir, aquela fonte falha e o motivo é registrado no Log. As demais fontes continuam sendo processadas.</w:t>
+            </w:r>
+          </w:p>
+        </w:tc>
+      </w:tr>
+    </w:tbl>
+    <w:p>
+      <w:pPr>
+        <w:spacing w:after="20"/>
+      </w:pPr>
+    </w:p>
+    <w:p>
+      <w:pPr>
+        <w:pStyle w:val="Heading2"/>
+      </w:pPr>
+      <w:r>
+        <w:t>6.5 Mais de uma fonte para o mesmo dia</w:t>
+      </w:r>
+    </w:p>
+    <w:p>
+      <w:r>
+        <w:t>As fontes são tratadas em ordem de nome. Se duas fontes produzirem um resultado para o mesmo dia comercial, o aplicativo substitui o resultado anterior pelo resultado da fonte processada por último. Assim, existe apenas um arquivo final para cada dia.</w:t>
+      </w:r>
+    </w:p>
+    <w:tbl>
+      <w:tblPr>
+        <w:tblW w:type="auto" w:w="0"/>
+        <w:jc w:val="center"/>
+        <w:tblLayout w:type="fixed"/>
+        <w:tblLook w:firstColumn="1" w:firstRow="1" w:lastColumn="0" w:lastRow="0" w:noHBand="0" w:noVBand="1" w:val="04A0"/>
+      </w:tblPr>
+      <w:tblGrid>
+        <w:gridCol w:w="9792"/>
+      </w:tblGrid>
+      <w:tr>
+        <w:tc>
+          <w:tcPr>
+            <w:tcW w:type="dxa" w:w="9576"/>
+            <w:shd w:fill="EAF8FB"/>
+            <w:tcMar>
+              <w:top w:w="120" w:type="dxa"/>
+              <w:start w:w="160" w:type="dxa"/>
+              <w:bottom w:w="120" w:type="dxa"/>
+              <w:end w:w="160" w:type="dxa"/>
+            </w:tcMar>
+          </w:tcPr>
+          <w:p>
+            <w:pPr>
+              <w:spacing w:after="0"/>
+            </w:pPr>
+            <w:r>
+              <w:rPr>
+                <w:rFonts w:ascii="Calibri" w:hAnsi="Calibri"/>
+                <w:b/>
+                <w:i w:val="0"/>
+                <w:color w:val="16202A"/>
+                <w:sz w:val="20"/>
+              </w:rPr>
+              <w:t xml:space="preserve">Conferência: </w:t>
+            </w:r>
+            <w:r>
+              <w:rPr>
+                <w:rFonts w:ascii="Calibri" w:hAnsi="Calibri"/>
+                <w:b w:val="0"/>
+                <w:i w:val="0"/>
+                <w:color w:val="16202A"/>
+                <w:sz w:val="20"/>
+              </w:rPr>
+              <w:t>Quando houver bases revisadas ou reenviadas, verifique no Log quais fontes foram processadas e valide o arquivo final do dia antes de utilizá-lo em produção.</w:t>
+            </w:r>
+          </w:p>
+        </w:tc>
+      </w:tr>
+    </w:tbl>
+    <w:p>
+      <w:pPr>
+        <w:spacing w:after="20"/>
+      </w:pPr>
+    </w:p>
+    <w:p>
+      <w:pPr>
+        <w:pStyle w:val="Heading2"/>
+      </w:pPr>
+      <w:r>
+        <w:t>6.6 Saídas geradas</w:t>
       </w:r>
     </w:p>
     <w:tbl>
@@ -2371,7 +1728,7 @@
                 <w:color w:val="16202A"/>
                 <w:sz w:val="20"/>
               </w:rPr>
-              <w:t>CSV</w:t>
+              <w:t>Arquivo diário</w:t>
             </w:r>
           </w:p>
         </w:tc>
@@ -2395,7 +1752,7 @@
                 <w:color w:val="16202A"/>
                 <w:sz w:val="20"/>
               </w:rPr>
-              <w:t>Salva os arquivos CSV/TXT selecionados mantendo o formato original.</w:t>
+              <w:t>Um arquivo para cada FECHA_COMERCIAL encontrada no mês, com sufixo _DIA_AAAAMMDD.</w:t>
             </w:r>
           </w:p>
         </w:tc>
@@ -2422,7 +1779,7 @@
                 <w:color w:val="16202A"/>
                 <w:sz w:val="20"/>
               </w:rPr>
-              <w:t>xlsx</w:t>
+              <w:t>CONCATENADO</w:t>
             </w:r>
           </w:p>
         </w:tc>
@@ -2446,7 +1803,109 @@
                 <w:color w:val="16202A"/>
                 <w:sz w:val="20"/>
               </w:rPr>
-              <w:t>Converte os arquivos CSV/TXT encontrados para Excel.</w:t>
+              <w:t>CONCATENADO_AAAAMM reúne os dias finais em ordem cronológica.</w:t>
+            </w:r>
+          </w:p>
+        </w:tc>
+      </w:tr>
+      <w:tr>
+        <w:tc>
+          <w:tcPr>
+            <w:tcW w:type="dxa" w:w="2520"/>
+            <w:shd w:fill="F4F6F8"/>
+            <w:tcMar>
+              <w:top w:w="90" w:type="dxa"/>
+              <w:start w:w="120" w:type="dxa"/>
+              <w:bottom w:w="90" w:type="dxa"/>
+              <w:end w:w="120" w:type="dxa"/>
+            </w:tcMar>
+            <w:vAlign w:val="center"/>
+          </w:tcPr>
+          <w:p>
+            <w:r>
+              <w:rPr>
+                <w:rFonts w:ascii="Calibri" w:hAnsi="Calibri"/>
+                <w:b/>
+                <w:i w:val="0"/>
+                <w:color w:val="16202A"/>
+                <w:sz w:val="20"/>
+              </w:rPr>
+              <w:t>CSV</w:t>
+            </w:r>
+          </w:p>
+        </w:tc>
+        <w:tc>
+          <w:tcPr>
+            <w:tcW w:type="dxa" w:w="7056"/>
+            <w:tcMar>
+              <w:top w:w="90" w:type="dxa"/>
+              <w:start w:w="120" w:type="dxa"/>
+              <w:bottom w:w="90" w:type="dxa"/>
+              <w:end w:w="120" w:type="dxa"/>
+            </w:tcMar>
+            <w:vAlign w:val="center"/>
+          </w:tcPr>
+          <w:p>
+            <w:r>
+              <w:rPr>
+                <w:rFonts w:ascii="Calibri" w:hAnsi="Calibri"/>
+                <w:b w:val="0"/>
+                <w:i w:val="0"/>
+                <w:color w:val="16202A"/>
+                <w:sz w:val="20"/>
+              </w:rPr>
+              <w:t>Mantém as saídas diárias e o concatenado em CSV.</w:t>
+            </w:r>
+          </w:p>
+        </w:tc>
+      </w:tr>
+      <w:tr>
+        <w:tc>
+          <w:tcPr>
+            <w:tcW w:type="dxa" w:w="2520"/>
+            <w:shd w:fill="F4F6F8"/>
+            <w:tcMar>
+              <w:top w:w="90" w:type="dxa"/>
+              <w:start w:w="120" w:type="dxa"/>
+              <w:bottom w:w="90" w:type="dxa"/>
+              <w:end w:w="120" w:type="dxa"/>
+            </w:tcMar>
+            <w:vAlign w:val="center"/>
+          </w:tcPr>
+          <w:p>
+            <w:r>
+              <w:rPr>
+                <w:rFonts w:ascii="Calibri" w:hAnsi="Calibri"/>
+                <w:b/>
+                <w:i w:val="0"/>
+                <w:color w:val="16202A"/>
+                <w:sz w:val="20"/>
+              </w:rPr>
+              <w:t>XLSX</w:t>
+            </w:r>
+          </w:p>
+        </w:tc>
+        <w:tc>
+          <w:tcPr>
+            <w:tcW w:type="dxa" w:w="7056"/>
+            <w:tcMar>
+              <w:top w:w="90" w:type="dxa"/>
+              <w:start w:w="120" w:type="dxa"/>
+              <w:bottom w:w="90" w:type="dxa"/>
+              <w:end w:w="120" w:type="dxa"/>
+            </w:tcMar>
+            <w:vAlign w:val="center"/>
+          </w:tcPr>
+          <w:p>
+            <w:r>
+              <w:rPr>
+                <w:rFonts w:ascii="Calibri" w:hAnsi="Calibri"/>
+                <w:b w:val="0"/>
+                <w:i w:val="0"/>
+                <w:color w:val="16202A"/>
+                <w:sz w:val="20"/>
+              </w:rPr>
+              <w:t>Converte cada saída diária e o concatenado para Excel.</w:t>
             </w:r>
           </w:p>
         </w:tc>
@@ -2497,7 +1956,7 @@
                 <w:color w:val="16202A"/>
                 <w:sz w:val="20"/>
               </w:rPr>
-              <w:t>Salva uma cópia original e outra em Excel para cada arquivo.</w:t>
+              <w:t>Entrega as versões CSV e XLSX.</w:t>
             </w:r>
           </w:p>
         </w:tc>
@@ -2505,16 +1964,21 @@
     </w:tbl>
     <w:p/>
     <w:p>
+      <w:r>
+        <w:t>Na concatenação, o cabeçalho do primeiro dia é mantido e os cabeçalhos dos dias seguintes são removidos, evitando linhas de título repetidas no meio da base.</w:t>
+      </w:r>
+    </w:p>
+    <w:p>
       <w:pPr>
         <w:pStyle w:val="Heading2"/>
       </w:pPr>
       <w:r>
-        <w:t>8.1 Escolher o conteúdo</w:t>
+        <w:t>6.7 Progresso, erros e validação</w:t>
       </w:r>
     </w:p>
     <w:p>
       <w:r>
-        <w:t>Após iniciar o download, a janela Escolher download apresenta opções conforme os nomes existentes na pasta:</w:t>
+        <w:t>A barra de progresso alterna entre Baixando e tratando bases, Salvando dias finais e Gerando concatenado. Erros individuais aumentam o contador, mas não interrompem automaticamente os outros arquivos.</w:t>
       </w:r>
     </w:p>
     <w:p>
@@ -2529,7 +1993,7 @@
           <w:color w:val="16202A"/>
           <w:sz w:val="21"/>
         </w:rPr>
-        <w:t>Baixar Todos Arquivos: processa todos os CSV/TXT da pasta.</w:t>
+        <w:t>Confira se todos os dias esperados foram gerados.</w:t>
       </w:r>
     </w:p>
     <w:p>
@@ -2544,7 +2008,7 @@
           <w:color w:val="16202A"/>
           <w:sz w:val="21"/>
         </w:rPr>
-        <w:t>Baixar período MM/AAAA: processa somente arquivos cujo nome contém uma data válida no padrão AAAAMMDD para o período escolhido.</w:t>
+        <w:t>Abra uma amostra e valide cabeçalhos, separador, datas e quantidade de linhas.</w:t>
       </w:r>
     </w:p>
     <w:p>
@@ -2559,73 +2023,7 @@
           <w:color w:val="16202A"/>
           <w:sz w:val="21"/>
         </w:rPr>
-        <w:t>Baixar Venda Diária do mês MM/AAAA: inicia o tratamento especial descrito na próxima seção.</w:t>
-      </w:r>
-    </w:p>
-    <w:p>
-      <w:pPr>
-        <w:pStyle w:val="ListNumber"/>
-      </w:pPr>
-      <w:r>
-        <w:rPr>
-          <w:rFonts w:ascii="Calibri" w:hAnsi="Calibri"/>
-          <w:b w:val="0"/>
-          <w:i w:val="0"/>
-          <w:color w:val="16202A"/>
-          <w:sz w:val="21"/>
-        </w:rPr>
-        <w:t>Selecione a opção desejada.</w:t>
-      </w:r>
-    </w:p>
-    <w:p>
-      <w:pPr>
-        <w:pStyle w:val="ListNumber"/>
-      </w:pPr>
-      <w:r>
-        <w:rPr>
-          <w:rFonts w:ascii="Calibri" w:hAnsi="Calibri"/>
-          <w:b w:val="0"/>
-          <w:i w:val="0"/>
-          <w:color w:val="16202A"/>
-          <w:sz w:val="21"/>
-        </w:rPr>
-        <w:t>Escolha uma pasta local de destino.</w:t>
-      </w:r>
-    </w:p>
-    <w:p>
-      <w:pPr>
-        <w:pStyle w:val="ListNumber"/>
-      </w:pPr>
-      <w:r>
-        <w:rPr>
-          <w:rFonts w:ascii="Calibri" w:hAnsi="Calibri"/>
-          <w:b w:val="0"/>
-          <w:i w:val="0"/>
-          <w:color w:val="16202A"/>
-          <w:sz w:val="21"/>
-        </w:rPr>
-        <w:t>Aguarde o processamento terminar antes de fechar o aplicativo.</w:t>
-      </w:r>
-    </w:p>
-    <w:p>
-      <w:pPr>
-        <w:pStyle w:val="Heading1"/>
-      </w:pPr>
-      <w:r>
-        <w:t>9. Processamento de Venda Diária</w:t>
-      </w:r>
-    </w:p>
-    <w:p>
-      <w:r>
-        <w:t>Este modo reconhece arquivos com os padrões BR_VENTAS_AAAAMMDD e BR_VENDAS_DIARIA_COCACOLA_GPA_ENERGETICOS_SEM_CONCORRENCIA_AAAAMMDD, com ou sem extensão CSV/TXT.</w:t>
-      </w:r>
-    </w:p>
-    <w:p>
-      <w:pPr>
-        <w:pStyle w:val="Heading2"/>
-      </w:pPr>
-      <w:r>
-        <w:t>9.1 Como o período é calculado</w:t>
+        <w:t>Confira o CONCATENADO_AAAAMM e verifique se há apenas um cabeçalho.</w:t>
       </w:r>
     </w:p>
     <w:p>
@@ -2640,7 +2038,7 @@
           <w:color w:val="16202A"/>
           <w:sz w:val="21"/>
         </w:rPr>
-        <w:t>O aplicativo usa arquivos desde o primeiro dia do mês selecionado até dez dias depois do último dia do mês.</w:t>
+        <w:t>Leia avisos e erros no Log antes de usar os arquivos.</w:t>
       </w:r>
     </w:p>
     <w:p>
@@ -2655,75 +2053,20 @@
           <w:color w:val="16202A"/>
           <w:sz w:val="21"/>
         </w:rPr>
-        <w:t>Dentro de cada base, utiliza a coluna FECHA_COMERCIAL para separar os registros por dia.</w:t>
+        <w:t>Se um dia estiver ausente, confirme se alguma fonte possui FECHA_COMERCIAL correspondente e se está dentro do intervalo aceito.</w:t>
       </w:r>
     </w:p>
     <w:p>
       <w:pPr>
-        <w:pStyle w:val="ListBullet"/>
+        <w:pStyle w:val="Heading1"/>
       </w:pPr>
       <w:r>
-        <w:rPr>
-          <w:rFonts w:ascii="Calibri" w:hAnsi="Calibri"/>
-          <w:b w:val="0"/>
-          <w:i w:val="0"/>
-          <w:color w:val="16202A"/>
-          <w:sz w:val="21"/>
-        </w:rPr>
-        <w:t>Somente datas no formato AAAAMMDD pertencentes ao mês escolhido entram nos arquivos finais.</w:t>
+        <w:t>7. Atualizações</w:t>
       </w:r>
     </w:p>
     <w:p>
-      <w:pPr>
-        <w:pStyle w:val="Heading2"/>
-      </w:pPr>
       <w:r>
-        <w:t>9.2 Arquivos gerados</w:t>
-      </w:r>
-    </w:p>
-    <w:p>
-      <w:pPr>
-        <w:pStyle w:val="ListBullet"/>
-      </w:pPr>
-      <w:r>
-        <w:rPr>
-          <w:rFonts w:ascii="Calibri" w:hAnsi="Calibri"/>
-          <w:b w:val="0"/>
-          <w:i w:val="0"/>
-          <w:color w:val="16202A"/>
-          <w:sz w:val="21"/>
-        </w:rPr>
-        <w:t>Um arquivo por dia encontrado, no formato solicitado (CSV, XLSX ou ambos).</w:t>
-      </w:r>
-    </w:p>
-    <w:p>
-      <w:pPr>
-        <w:pStyle w:val="ListBullet"/>
-      </w:pPr>
-      <w:r>
-        <w:rPr>
-          <w:rFonts w:ascii="Calibri" w:hAnsi="Calibri"/>
-          <w:b w:val="0"/>
-          <w:i w:val="0"/>
-          <w:color w:val="16202A"/>
-          <w:sz w:val="21"/>
-        </w:rPr>
-        <w:t>Um arquivo CONCATENADO_AAAAMM, reunindo os dias finais em ordem.</w:t>
-      </w:r>
-    </w:p>
-    <w:p>
-      <w:pPr>
-        <w:pStyle w:val="ListBullet"/>
-      </w:pPr>
-      <w:r>
-        <w:rPr>
-          <w:rFonts w:ascii="Calibri" w:hAnsi="Calibri"/>
-          <w:b w:val="0"/>
-          <w:i w:val="0"/>
-          <w:color w:val="16202A"/>
-          <w:sz w:val="21"/>
-        </w:rPr>
-        <w:t>Quando houver mais de uma fonte para o mesmo dia, o processamento mantém a versão mais recente tratada para aquele dia.</w:t>
+        <w:t>O aplicativo instalado consulta as Releases do GitHub quando há internet. Ao baixar uma versão nova, exibe a opção Reiniciar e atualizar. Esse recurso não funciona ao abrir o projeto com npm start.</w:t>
       </w:r>
     </w:p>
     <w:tbl>
@@ -2760,7 +2103,7 @@
                 <w:color w:val="A83232"/>
                 <w:sz w:val="20"/>
               </w:rPr>
-              <w:t xml:space="preserve">Requisito: </w:t>
+              <w:t xml:space="preserve">Versão inicial: </w:t>
             </w:r>
             <w:r>
               <w:rPr>
@@ -2770,7 +2113,7 @@
                 <w:color w:val="16202A"/>
                 <w:sz w:val="20"/>
               </w:rPr>
-              <w:t>A base precisa possuir a coluna FECHA_COMERCIAL. Se ela não existir, o arquivo será informado como erro no Log.</w:t>
+              <w:t>Se uma versão apresentar erro antes de abrir, ela não consegue executar o atualizador e a próxima versão corrigida precisa ser instalada manualmente uma vez.</w:t>
             </w:r>
           </w:p>
         </w:tc>
@@ -2786,290 +2129,7 @@
         <w:pStyle w:val="Heading1"/>
       </w:pPr>
       <w:r>
-        <w:t>10. Upload e criação de pastas</w:t>
-      </w:r>
-    </w:p>
-    <w:p>
-      <w:pPr>
-        <w:pStyle w:val="Heading2"/>
-      </w:pPr>
-      <w:r>
-        <w:t>10.1 Enviar um arquivo</w:t>
-      </w:r>
-    </w:p>
-    <w:p>
-      <w:pPr>
-        <w:pStyle w:val="ListNumber"/>
-      </w:pPr>
-      <w:r>
-        <w:rPr>
-          <w:rFonts w:ascii="Calibri" w:hAnsi="Calibri"/>
-          <w:b w:val="0"/>
-          <w:i w:val="0"/>
-          <w:color w:val="16202A"/>
-          <w:sz w:val="21"/>
-        </w:rPr>
-        <w:t>Navegue até a pasta remota de destino.</w:t>
-      </w:r>
-    </w:p>
-    <w:p>
-      <w:pPr>
-        <w:pStyle w:val="ListNumber"/>
-      </w:pPr>
-      <w:r>
-        <w:rPr>
-          <w:rFonts w:ascii="Calibri" w:hAnsi="Calibri"/>
-          <w:b w:val="0"/>
-          <w:i w:val="0"/>
-          <w:color w:val="16202A"/>
-          <w:sz w:val="21"/>
-        </w:rPr>
-        <w:t>Clique em Upload.</w:t>
-      </w:r>
-    </w:p>
-    <w:p>
-      <w:pPr>
-        <w:pStyle w:val="ListNumber"/>
-      </w:pPr>
-      <w:r>
-        <w:rPr>
-          <w:rFonts w:ascii="Calibri" w:hAnsi="Calibri"/>
-          <w:b w:val="0"/>
-          <w:i w:val="0"/>
-          <w:color w:val="16202A"/>
-          <w:sz w:val="21"/>
-        </w:rPr>
-        <w:t>Selecione um arquivo do computador.</w:t>
-      </w:r>
-    </w:p>
-    <w:p>
-      <w:pPr>
-        <w:pStyle w:val="ListNumber"/>
-      </w:pPr>
-      <w:r>
-        <w:rPr>
-          <w:rFonts w:ascii="Calibri" w:hAnsi="Calibri"/>
-          <w:b w:val="0"/>
-          <w:i w:val="0"/>
-          <w:color w:val="16202A"/>
-          <w:sz w:val="21"/>
-        </w:rPr>
-        <w:t>Aguarde a confirmação e confira o item na lista atualizada.</w:t>
-      </w:r>
-    </w:p>
-    <w:p>
-      <w:pPr>
-        <w:pStyle w:val="Heading2"/>
-      </w:pPr>
-      <w:r>
-        <w:t>10.2 Criar uma pasta</w:t>
-      </w:r>
-    </w:p>
-    <w:p>
-      <w:pPr>
-        <w:pStyle w:val="ListNumber"/>
-      </w:pPr>
-      <w:r>
-        <w:rPr>
-          <w:rFonts w:ascii="Calibri" w:hAnsi="Calibri"/>
-          <w:b w:val="0"/>
-          <w:i w:val="0"/>
-          <w:color w:val="16202A"/>
-          <w:sz w:val="21"/>
-        </w:rPr>
-        <w:t>Navegue até a pasta que receberá a nova subpasta.</w:t>
-      </w:r>
-    </w:p>
-    <w:p>
-      <w:pPr>
-        <w:pStyle w:val="ListNumber"/>
-      </w:pPr>
-      <w:r>
-        <w:rPr>
-          <w:rFonts w:ascii="Calibri" w:hAnsi="Calibri"/>
-          <w:b w:val="0"/>
-          <w:i w:val="0"/>
-          <w:color w:val="16202A"/>
-          <w:sz w:val="21"/>
-        </w:rPr>
-        <w:t>Clique em + Pasta.</w:t>
-      </w:r>
-    </w:p>
-    <w:p>
-      <w:pPr>
-        <w:pStyle w:val="ListNumber"/>
-      </w:pPr>
-      <w:r>
-        <w:rPr>
-          <w:rFonts w:ascii="Calibri" w:hAnsi="Calibri"/>
-          <w:b w:val="0"/>
-          <w:i w:val="0"/>
-          <w:color w:val="16202A"/>
-          <w:sz w:val="21"/>
-        </w:rPr>
-        <w:t>Digite o nome e clique em Confirmar.</w:t>
-      </w:r>
-    </w:p>
-    <w:p>
-      <w:pPr>
-        <w:pStyle w:val="Heading1"/>
-      </w:pPr>
-      <w:r>
-        <w:t>11. Renomear e excluir</w:t>
-      </w:r>
-    </w:p>
-    <w:p>
-      <w:pPr>
-        <w:pStyle w:val="Heading2"/>
-      </w:pPr>
-      <w:r>
-        <w:t>11.1 Renomear</w:t>
-      </w:r>
-    </w:p>
-    <w:p>
-      <w:pPr>
-        <w:pStyle w:val="ListNumber"/>
-      </w:pPr>
-      <w:r>
-        <w:rPr>
-          <w:rFonts w:ascii="Calibri" w:hAnsi="Calibri"/>
-          <w:b w:val="0"/>
-          <w:i w:val="0"/>
-          <w:color w:val="16202A"/>
-          <w:sz w:val="21"/>
-        </w:rPr>
-        <w:t>Clique em ren na linha do arquivo ou pasta.</w:t>
-      </w:r>
-    </w:p>
-    <w:p>
-      <w:pPr>
-        <w:pStyle w:val="ListNumber"/>
-      </w:pPr>
-      <w:r>
-        <w:rPr>
-          <w:rFonts w:ascii="Calibri" w:hAnsi="Calibri"/>
-          <w:b w:val="0"/>
-          <w:i w:val="0"/>
-          <w:color w:val="16202A"/>
-          <w:sz w:val="21"/>
-        </w:rPr>
-        <w:t>Informe o novo nome e confirme.</w:t>
-      </w:r>
-    </w:p>
-    <w:p>
-      <w:pPr>
-        <w:pStyle w:val="Heading2"/>
-      </w:pPr>
-      <w:r>
-        <w:t>11.2 Excluir</w:t>
-      </w:r>
-    </w:p>
-    <w:p>
-      <w:pPr>
-        <w:pStyle w:val="ListNumber"/>
-      </w:pPr>
-      <w:r>
-        <w:rPr>
-          <w:rFonts w:ascii="Calibri" w:hAnsi="Calibri"/>
-          <w:b w:val="0"/>
-          <w:i w:val="0"/>
-          <w:color w:val="16202A"/>
-          <w:sz w:val="21"/>
-        </w:rPr>
-        <w:t>Clique em del na linha do item.</w:t>
-      </w:r>
-    </w:p>
-    <w:p>
-      <w:pPr>
-        <w:pStyle w:val="ListNumber"/>
-      </w:pPr>
-      <w:r>
-        <w:rPr>
-          <w:rFonts w:ascii="Calibri" w:hAnsi="Calibri"/>
-          <w:b w:val="0"/>
-          <w:i w:val="0"/>
-          <w:color w:val="16202A"/>
-          <w:sz w:val="21"/>
-        </w:rPr>
-        <w:t>Digite exatamente o nome atual do arquivo ou pasta.</w:t>
-      </w:r>
-    </w:p>
-    <w:p>
-      <w:pPr>
-        <w:pStyle w:val="ListNumber"/>
-      </w:pPr>
-      <w:r>
-        <w:rPr>
-          <w:rFonts w:ascii="Calibri" w:hAnsi="Calibri"/>
-          <w:b w:val="0"/>
-          <w:i w:val="0"/>
-          <w:color w:val="16202A"/>
-          <w:sz w:val="21"/>
-        </w:rPr>
-        <w:t>Confirme a operação.</w:t>
-      </w:r>
-    </w:p>
-    <w:tbl>
-      <w:tblPr>
-        <w:tblW w:type="auto" w:w="0"/>
-        <w:jc w:val="center"/>
-        <w:tblLayout w:type="fixed"/>
-        <w:tblLook w:firstColumn="1" w:firstRow="1" w:lastColumn="0" w:lastRow="0" w:noHBand="0" w:noVBand="1" w:val="04A0"/>
-      </w:tblPr>
-      <w:tblGrid>
-        <w:gridCol w:w="9792"/>
-      </w:tblGrid>
-      <w:tr>
-        <w:tc>
-          <w:tcPr>
-            <w:tcW w:type="dxa" w:w="9576"/>
-            <w:shd w:fill="FDEEEE"/>
-            <w:tcMar>
-              <w:top w:w="120" w:type="dxa"/>
-              <w:start w:w="160" w:type="dxa"/>
-              <w:bottom w:w="120" w:type="dxa"/>
-              <w:end w:w="160" w:type="dxa"/>
-            </w:tcMar>
-          </w:tcPr>
-          <w:p>
-            <w:pPr>
-              <w:spacing w:after="0"/>
-            </w:pPr>
-            <w:r>
-              <w:rPr>
-                <w:rFonts w:ascii="Calibri" w:hAnsi="Calibri"/>
-                <w:b/>
-                <w:i w:val="0"/>
-                <w:color w:val="A83232"/>
-                <w:sz w:val="20"/>
-              </w:rPr>
-              <w:t xml:space="preserve">Atenção: </w:t>
-            </w:r>
-            <w:r>
-              <w:rPr>
-                <w:rFonts w:ascii="Calibri" w:hAnsi="Calibri"/>
-                <w:b w:val="0"/>
-                <w:i w:val="0"/>
-                <w:color w:val="16202A"/>
-                <w:sz w:val="20"/>
-              </w:rPr>
-              <w:t>A exclusão é realizada diretamente no servidor. Pastas são removidas recursivamente, inclusive com seu conteúdo. Não há lixeira ou botão de desfazer.</w:t>
-            </w:r>
-          </w:p>
-        </w:tc>
-      </w:tr>
-    </w:tbl>
-    <w:p>
-      <w:pPr>
-        <w:spacing w:after="20"/>
-      </w:pPr>
-    </w:p>
-    <w:p>
-      <w:pPr>
-        <w:pStyle w:val="Heading1"/>
-      </w:pPr>
-      <w:r>
-        <w:t>12. Acompanhar operações</w:t>
+        <w:t>8. Solução rápida</w:t>
       </w:r>
     </w:p>
     <w:tbl>
@@ -3161,7 +2221,7 @@
                 <w:color w:val="16202A"/>
                 <w:sz w:val="20"/>
               </w:rPr>
-              <w:t>Indicador superior</w:t>
+              <w:t>Falha na conexão</w:t>
             </w:r>
           </w:p>
         </w:tc>
@@ -3185,7 +2245,7 @@
                 <w:color w:val="16202A"/>
                 <w:sz w:val="20"/>
               </w:rPr>
-              <w:t>Mostra se o aplicativo está conectado e identifica usuário e servidor.</w:t>
+              <w:t>Revise host, porta, usuário, senha, internet/VPN e acesso ao servidor.</w:t>
             </w:r>
           </w:p>
         </w:tc>
@@ -3212,7 +2272,7 @@
                 <w:color w:val="16202A"/>
                 <w:sz w:val="20"/>
               </w:rPr>
-              <w:t>Notificações</w:t>
+              <w:t>Nenhum CSV</w:t>
             </w:r>
           </w:p>
         </w:tc>
@@ -3236,7 +2296,7 @@
                 <w:color w:val="16202A"/>
                 <w:sz w:val="20"/>
               </w:rPr>
-              <w:t>Mensagens rápidas confirmam sucesso, informação ou erro.</w:t>
+              <w:t>A pasta ou período não possui CSV/TXT compatível.</w:t>
             </w:r>
           </w:p>
         </w:tc>
@@ -3263,7 +2323,7 @@
                 <w:color w:val="16202A"/>
                 <w:sz w:val="20"/>
               </w:rPr>
-              <w:t>Log</w:t>
+              <w:t>Venda diária falhou</w:t>
             </w:r>
           </w:p>
         </w:tc>
@@ -3287,7 +2347,7 @@
                 <w:color w:val="16202A"/>
                 <w:sz w:val="20"/>
               </w:rPr>
-              <w:t>Mantém o histórico textual da sessão, incluindo caminhos, avisos e erros.</w:t>
+              <w:t>Confirme FECHA_COMERCIAL e datas AAAAMMDD; consulte o Log.</w:t>
             </w:r>
           </w:p>
         </w:tc>
@@ -3314,7 +2374,7 @@
                 <w:color w:val="16202A"/>
                 <w:sz w:val="20"/>
               </w:rPr>
-              <w:t>Barra de progresso</w:t>
+              <w:t>Erro de gravação</w:t>
             </w:r>
           </w:p>
         </w:tc>
@@ -3338,187 +2398,7 @@
                 <w:color w:val="16202A"/>
                 <w:sz w:val="20"/>
               </w:rPr>
-              <w:t>Apresenta percentual, arquivos concluídos e quantidade de erros.</w:t>
-            </w:r>
-          </w:p>
-        </w:tc>
-      </w:tr>
-    </w:tbl>
-    <w:p/>
-    <w:p>
-      <w:r>
-        <w:t>Em downloads em lote, um erro em determinado arquivo não impede necessariamente os demais. Ao final, confira a quantidade de erros e os detalhes registrados no Log.</w:t>
-      </w:r>
-    </w:p>
-    <w:p>
-      <w:pPr>
-        <w:pStyle w:val="Heading1"/>
-      </w:pPr>
-      <w:r>
-        <w:t>13. Boas práticas de segurança</w:t>
-      </w:r>
-    </w:p>
-    <w:p>
-      <w:pPr>
-        <w:pStyle w:val="ListBullet"/>
-      </w:pPr>
-      <w:r>
-        <w:rPr>
-          <w:rFonts w:ascii="Calibri" w:hAnsi="Calibri"/>
-          <w:b w:val="0"/>
-          <w:i w:val="0"/>
-          <w:color w:val="16202A"/>
-          <w:sz w:val="21"/>
-        </w:rPr>
-        <w:t>Confirme host, pasta e nome do item antes de enviar, renomear ou excluir.</w:t>
-      </w:r>
-    </w:p>
-    <w:p>
-      <w:pPr>
-        <w:pStyle w:val="ListBullet"/>
-      </w:pPr>
-      <w:r>
-        <w:rPr>
-          <w:rFonts w:ascii="Calibri" w:hAnsi="Calibri"/>
-          <w:b w:val="0"/>
-          <w:i w:val="0"/>
-          <w:color w:val="16202A"/>
-          <w:sz w:val="21"/>
-        </w:rPr>
-        <w:t>Não compartilhe senhas nem inclua credenciais em nomes de favoritos.</w:t>
-      </w:r>
-    </w:p>
-    <w:p>
-      <w:pPr>
-        <w:pStyle w:val="ListBullet"/>
-      </w:pPr>
-      <w:r>
-        <w:rPr>
-          <w:rFonts w:ascii="Calibri" w:hAnsi="Calibri"/>
-          <w:b w:val="0"/>
-          <w:i w:val="0"/>
-          <w:color w:val="16202A"/>
-          <w:sz w:val="21"/>
-        </w:rPr>
-        <w:t>Use contas com apenas as permissões necessárias para o trabalho.</w:t>
-      </w:r>
-    </w:p>
-    <w:p>
-      <w:pPr>
-        <w:pStyle w:val="ListBullet"/>
-      </w:pPr>
-      <w:r>
-        <w:rPr>
-          <w:rFonts w:ascii="Calibri" w:hAnsi="Calibri"/>
-          <w:b w:val="0"/>
-          <w:i w:val="0"/>
-          <w:color w:val="16202A"/>
-          <w:sz w:val="21"/>
-        </w:rPr>
-        <w:t>Desconecte-se quando terminar, especialmente em computadores compartilhados.</w:t>
-      </w:r>
-    </w:p>
-    <w:p>
-      <w:pPr>
-        <w:pStyle w:val="ListBullet"/>
-      </w:pPr>
-      <w:r>
-        <w:rPr>
-          <w:rFonts w:ascii="Calibri" w:hAnsi="Calibri"/>
-          <w:b w:val="0"/>
-          <w:i w:val="0"/>
-          <w:color w:val="16202A"/>
-          <w:sz w:val="21"/>
-        </w:rPr>
-        <w:t>Evite fechar o programa durante downloads, uploads ou conversões.</w:t>
-      </w:r>
-    </w:p>
-    <w:p>
-      <w:pPr>
-        <w:pStyle w:val="ListBullet"/>
-      </w:pPr>
-      <w:r>
-        <w:rPr>
-          <w:rFonts w:ascii="Calibri" w:hAnsi="Calibri"/>
-          <w:b w:val="0"/>
-          <w:i w:val="0"/>
-          <w:color w:val="16202A"/>
-          <w:sz w:val="21"/>
-        </w:rPr>
-        <w:t>Valide os arquivos gerados antes de substituir bases de produção.</w:t>
-      </w:r>
-    </w:p>
-    <w:p>
-      <w:pPr>
-        <w:pStyle w:val="Heading1"/>
-      </w:pPr>
-      <w:r>
-        <w:t>14. Solução de problemas</w:t>
-      </w:r>
-    </w:p>
-    <w:tbl>
-      <w:tblPr>
-        <w:tblStyle w:val="TableGrid"/>
-        <w:tblW w:type="auto" w:w="0"/>
-        <w:jc w:val="center"/>
-        <w:tblLayout w:type="fixed"/>
-        <w:tblLook w:firstColumn="1" w:firstRow="1" w:lastColumn="0" w:lastRow="0" w:noHBand="0" w:noVBand="1" w:val="04A0"/>
-      </w:tblPr>
-      <w:tblGrid>
-        <w:gridCol w:w="4896"/>
-        <w:gridCol w:w="4896"/>
-      </w:tblGrid>
-      <w:tr>
-        <w:trPr>
-          <w:tblHeader w:val="true"/>
-        </w:trPr>
-        <w:tc>
-          <w:tcPr>
-            <w:tcW w:type="dxa" w:w="2520"/>
-            <w:shd w:fill="00B8D4"/>
-            <w:tcMar>
-              <w:top w:w="90" w:type="dxa"/>
-              <w:start w:w="120" w:type="dxa"/>
-              <w:bottom w:w="90" w:type="dxa"/>
-              <w:end w:w="120" w:type="dxa"/>
-            </w:tcMar>
-            <w:vAlign w:val="center"/>
-          </w:tcPr>
-          <w:p>
-            <w:r>
-              <w:rPr>
-                <w:rFonts w:ascii="Calibri" w:hAnsi="Calibri"/>
-                <w:b/>
-                <w:i w:val="0"/>
-                <w:color w:val="FFFFFF"/>
-                <w:sz w:val="20"/>
-              </w:rPr>
-              <w:t>Recurso</w:t>
-            </w:r>
-          </w:p>
-        </w:tc>
-        <w:tc>
-          <w:tcPr>
-            <w:tcW w:type="dxa" w:w="7056"/>
-            <w:shd w:fill="00B8D4"/>
-            <w:tcMar>
-              <w:top w:w="90" w:type="dxa"/>
-              <w:start w:w="120" w:type="dxa"/>
-              <w:bottom w:w="90" w:type="dxa"/>
-              <w:end w:w="120" w:type="dxa"/>
-            </w:tcMar>
-            <w:vAlign w:val="center"/>
-          </w:tcPr>
-          <w:p>
-            <w:r>
-              <w:rPr>
-                <w:rFonts w:ascii="Calibri" w:hAnsi="Calibri"/>
-                <w:b/>
-                <w:i w:val="0"/>
-                <w:color w:val="FFFFFF"/>
-                <w:sz w:val="20"/>
-              </w:rPr>
-              <w:t>O que faz</w:t>
+              <w:t>Verifique espaço em disco e permissão da pasta local.</w:t>
             </w:r>
           </w:p>
         </w:tc>
@@ -3545,7 +2425,7 @@
                 <w:color w:val="16202A"/>
                 <w:sz w:val="20"/>
               </w:rPr>
-              <w:t>Preencha host e usuário</w:t>
+              <w:t>Suporte</w:t>
             </w:r>
           </w:p>
         </w:tc>
@@ -3569,1114 +2449,13 @@
                 <w:color w:val="16202A"/>
                 <w:sz w:val="20"/>
               </w:rPr>
-              <w:t>Informe os dois campos obrigatórios antes de conectar.</w:t>
-            </w:r>
-          </w:p>
-        </w:tc>
-      </w:tr>
-      <w:tr>
-        <w:tc>
-          <w:tcPr>
-            <w:tcW w:type="dxa" w:w="2520"/>
-            <w:shd w:fill="F4F6F8"/>
-            <w:tcMar>
-              <w:top w:w="90" w:type="dxa"/>
-              <w:start w:w="120" w:type="dxa"/>
-              <w:bottom w:w="90" w:type="dxa"/>
-              <w:end w:w="120" w:type="dxa"/>
-            </w:tcMar>
-            <w:vAlign w:val="center"/>
-          </w:tcPr>
-          <w:p>
-            <w:r>
-              <w:rPr>
-                <w:rFonts w:ascii="Calibri" w:hAnsi="Calibri"/>
-                <w:b/>
-                <w:i w:val="0"/>
-                <w:color w:val="16202A"/>
-                <w:sz w:val="20"/>
-              </w:rPr>
-              <w:t>Falha na conexão</w:t>
-            </w:r>
-          </w:p>
-        </w:tc>
-        <w:tc>
-          <w:tcPr>
-            <w:tcW w:type="dxa" w:w="7056"/>
-            <w:tcMar>
-              <w:top w:w="90" w:type="dxa"/>
-              <w:start w:w="120" w:type="dxa"/>
-              <w:bottom w:w="90" w:type="dxa"/>
-              <w:end w:w="120" w:type="dxa"/>
-            </w:tcMar>
-            <w:vAlign w:val="center"/>
-          </w:tcPr>
-          <w:p>
-            <w:r>
-              <w:rPr>
-                <w:rFonts w:ascii="Calibri" w:hAnsi="Calibri"/>
-                <w:b w:val="0"/>
-                <w:i w:val="0"/>
-                <w:color w:val="16202A"/>
-                <w:sz w:val="20"/>
-              </w:rPr>
-              <w:t>Confira host, porta, usuário, senha, internet/VPN e liberação do servidor.</w:t>
-            </w:r>
-          </w:p>
-        </w:tc>
-      </w:tr>
-      <w:tr>
-        <w:tc>
-          <w:tcPr>
-            <w:tcW w:type="dxa" w:w="2520"/>
-            <w:shd w:fill="F4F6F8"/>
-            <w:tcMar>
-              <w:top w:w="90" w:type="dxa"/>
-              <w:start w:w="120" w:type="dxa"/>
-              <w:bottom w:w="90" w:type="dxa"/>
-              <w:end w:w="120" w:type="dxa"/>
-            </w:tcMar>
-            <w:vAlign w:val="center"/>
-          </w:tcPr>
-          <w:p>
-            <w:r>
-              <w:rPr>
-                <w:rFonts w:ascii="Calibri" w:hAnsi="Calibri"/>
-                <w:b/>
-                <w:i w:val="0"/>
-                <w:color w:val="16202A"/>
-                <w:sz w:val="20"/>
-              </w:rPr>
-              <w:t>Tempo esgotado</w:t>
-            </w:r>
-          </w:p>
-        </w:tc>
-        <w:tc>
-          <w:tcPr>
-            <w:tcW w:type="dxa" w:w="7056"/>
-            <w:tcMar>
-              <w:top w:w="90" w:type="dxa"/>
-              <w:start w:w="120" w:type="dxa"/>
-              <w:bottom w:w="90" w:type="dxa"/>
-              <w:end w:w="120" w:type="dxa"/>
-            </w:tcMar>
-            <w:vAlign w:val="center"/>
-          </w:tcPr>
-          <w:p>
-            <w:r>
-              <w:rPr>
-                <w:rFonts w:ascii="Calibri" w:hAnsi="Calibri"/>
-                <w:b w:val="0"/>
-                <w:i w:val="0"/>
-                <w:color w:val="16202A"/>
-                <w:sz w:val="20"/>
-              </w:rPr>
-              <w:t>O servidor não respondeu no prazo; teste a rede ou solicite validação à infraestrutura.</w:t>
-            </w:r>
-          </w:p>
-        </w:tc>
-      </w:tr>
-      <w:tr>
-        <w:tc>
-          <w:tcPr>
-            <w:tcW w:type="dxa" w:w="2520"/>
-            <w:shd w:fill="F4F6F8"/>
-            <w:tcMar>
-              <w:top w:w="90" w:type="dxa"/>
-              <w:start w:w="120" w:type="dxa"/>
-              <w:bottom w:w="90" w:type="dxa"/>
-              <w:end w:w="120" w:type="dxa"/>
-            </w:tcMar>
-            <w:vAlign w:val="center"/>
-          </w:tcPr>
-          <w:p>
-            <w:r>
-              <w:rPr>
-                <w:rFonts w:ascii="Calibri" w:hAnsi="Calibri"/>
-                <w:b/>
-                <w:i w:val="0"/>
-                <w:color w:val="16202A"/>
-                <w:sz w:val="20"/>
-              </w:rPr>
-              <w:t>Não conectado</w:t>
-            </w:r>
-          </w:p>
-        </w:tc>
-        <w:tc>
-          <w:tcPr>
-            <w:tcW w:type="dxa" w:w="7056"/>
-            <w:tcMar>
-              <w:top w:w="90" w:type="dxa"/>
-              <w:start w:w="120" w:type="dxa"/>
-              <w:bottom w:w="90" w:type="dxa"/>
-              <w:end w:w="120" w:type="dxa"/>
-            </w:tcMar>
-            <w:vAlign w:val="center"/>
-          </w:tcPr>
-          <w:p>
-            <w:r>
-              <w:rPr>
-                <w:rFonts w:ascii="Calibri" w:hAnsi="Calibri"/>
-                <w:b w:val="0"/>
-                <w:i w:val="0"/>
-                <w:color w:val="16202A"/>
-                <w:sz w:val="20"/>
-              </w:rPr>
-              <w:t>Reconecte antes de tentar listar ou transferir arquivos.</w:t>
-            </w:r>
-          </w:p>
-        </w:tc>
-      </w:tr>
-      <w:tr>
-        <w:tc>
-          <w:tcPr>
-            <w:tcW w:type="dxa" w:w="2520"/>
-            <w:shd w:fill="F4F6F8"/>
-            <w:tcMar>
-              <w:top w:w="90" w:type="dxa"/>
-              <w:start w:w="120" w:type="dxa"/>
-              <w:bottom w:w="90" w:type="dxa"/>
-              <w:end w:w="120" w:type="dxa"/>
-            </w:tcMar>
-            <w:vAlign w:val="center"/>
-          </w:tcPr>
-          <w:p>
-            <w:r>
-              <w:rPr>
-                <w:rFonts w:ascii="Calibri" w:hAnsi="Calibri"/>
-                <w:b/>
-                <w:i w:val="0"/>
-                <w:color w:val="16202A"/>
-                <w:sz w:val="20"/>
-              </w:rPr>
-              <w:t>Nenhum CSV encontrado</w:t>
-            </w:r>
-          </w:p>
-        </w:tc>
-        <w:tc>
-          <w:tcPr>
-            <w:tcW w:type="dxa" w:w="7056"/>
-            <w:tcMar>
-              <w:top w:w="90" w:type="dxa"/>
-              <w:start w:w="120" w:type="dxa"/>
-              <w:bottom w:w="90" w:type="dxa"/>
-              <w:end w:w="120" w:type="dxa"/>
-            </w:tcMar>
-            <w:vAlign w:val="center"/>
-          </w:tcPr>
-          <w:p>
-            <w:r>
-              <w:rPr>
-                <w:rFonts w:ascii="Calibri" w:hAnsi="Calibri"/>
-                <w:b w:val="0"/>
-                <w:i w:val="0"/>
-                <w:color w:val="16202A"/>
-                <w:sz w:val="20"/>
-              </w:rPr>
-              <w:t>A pasta ou o período escolhido não possui arquivos .csv ou .txt compatíveis.</w:t>
-            </w:r>
-          </w:p>
-        </w:tc>
-      </w:tr>
-      <w:tr>
-        <w:tc>
-          <w:tcPr>
-            <w:tcW w:type="dxa" w:w="2520"/>
-            <w:shd w:fill="F4F6F8"/>
-            <w:tcMar>
-              <w:top w:w="90" w:type="dxa"/>
-              <w:start w:w="120" w:type="dxa"/>
-              <w:bottom w:w="90" w:type="dxa"/>
-              <w:end w:w="120" w:type="dxa"/>
-            </w:tcMar>
-            <w:vAlign w:val="center"/>
-          </w:tcPr>
-          <w:p>
-            <w:r>
-              <w:rPr>
-                <w:rFonts w:ascii="Calibri" w:hAnsi="Calibri"/>
-                <w:b/>
-                <w:i w:val="0"/>
-                <w:color w:val="16202A"/>
-                <w:sz w:val="20"/>
-              </w:rPr>
-              <w:t>Coluna não encontrada</w:t>
-            </w:r>
-          </w:p>
-        </w:tc>
-        <w:tc>
-          <w:tcPr>
-            <w:tcW w:type="dxa" w:w="7056"/>
-            <w:tcMar>
-              <w:top w:w="90" w:type="dxa"/>
-              <w:start w:w="120" w:type="dxa"/>
-              <w:bottom w:w="90" w:type="dxa"/>
-              <w:end w:w="120" w:type="dxa"/>
-            </w:tcMar>
-            <w:vAlign w:val="center"/>
-          </w:tcPr>
-          <w:p>
-            <w:r>
-              <w:rPr>
-                <w:rFonts w:ascii="Calibri" w:hAnsi="Calibri"/>
-                <w:b w:val="0"/>
-                <w:i w:val="0"/>
-                <w:color w:val="16202A"/>
-                <w:sz w:val="20"/>
-              </w:rPr>
-              <w:t>No modo Venda Diária, confirme a presença de FECHA_COMERCIAL no cabeçalho.</w:t>
-            </w:r>
-          </w:p>
-        </w:tc>
-      </w:tr>
-      <w:tr>
-        <w:tc>
-          <w:tcPr>
-            <w:tcW w:type="dxa" w:w="2520"/>
-            <w:shd w:fill="F4F6F8"/>
-            <w:tcMar>
-              <w:top w:w="90" w:type="dxa"/>
-              <w:start w:w="120" w:type="dxa"/>
-              <w:bottom w:w="90" w:type="dxa"/>
-              <w:end w:w="120" w:type="dxa"/>
-            </w:tcMar>
-            <w:vAlign w:val="center"/>
-          </w:tcPr>
-          <w:p>
-            <w:r>
-              <w:rPr>
-                <w:rFonts w:ascii="Calibri" w:hAnsi="Calibri"/>
-                <w:b/>
-                <w:i w:val="0"/>
-                <w:color w:val="16202A"/>
-                <w:sz w:val="20"/>
-              </w:rPr>
-              <w:t>Erro ao converter</w:t>
-            </w:r>
-          </w:p>
-        </w:tc>
-        <w:tc>
-          <w:tcPr>
-            <w:tcW w:type="dxa" w:w="7056"/>
-            <w:tcMar>
-              <w:top w:w="90" w:type="dxa"/>
-              <w:start w:w="120" w:type="dxa"/>
-              <w:bottom w:w="90" w:type="dxa"/>
-              <w:end w:w="120" w:type="dxa"/>
-            </w:tcMar>
-            <w:vAlign w:val="center"/>
-          </w:tcPr>
-          <w:p>
-            <w:r>
-              <w:rPr>
-                <w:rFonts w:ascii="Calibri" w:hAnsi="Calibri"/>
-                <w:b w:val="0"/>
-                <w:i w:val="0"/>
-                <w:color w:val="16202A"/>
-                <w:sz w:val="20"/>
-              </w:rPr>
-              <w:t>Verifique espaço em disco, acesso à pasta de destino e integridade do arquivo de origem.</w:t>
-            </w:r>
-          </w:p>
-        </w:tc>
-      </w:tr>
-      <w:tr>
-        <w:tc>
-          <w:tcPr>
-            <w:tcW w:type="dxa" w:w="2520"/>
-            <w:shd w:fill="F4F6F8"/>
-            <w:tcMar>
-              <w:top w:w="90" w:type="dxa"/>
-              <w:start w:w="120" w:type="dxa"/>
-              <w:bottom w:w="90" w:type="dxa"/>
-              <w:end w:w="120" w:type="dxa"/>
-            </w:tcMar>
-            <w:vAlign w:val="center"/>
-          </w:tcPr>
-          <w:p>
-            <w:r>
-              <w:rPr>
-                <w:rFonts w:ascii="Calibri" w:hAnsi="Calibri"/>
-                <w:b/>
-                <w:i w:val="0"/>
-                <w:color w:val="16202A"/>
-                <w:sz w:val="20"/>
-              </w:rPr>
-              <w:t>Nome não confere</w:t>
-            </w:r>
-          </w:p>
-        </w:tc>
-        <w:tc>
-          <w:tcPr>
-            <w:tcW w:type="dxa" w:w="7056"/>
-            <w:tcMar>
-              <w:top w:w="90" w:type="dxa"/>
-              <w:start w:w="120" w:type="dxa"/>
-              <w:bottom w:w="90" w:type="dxa"/>
-              <w:end w:w="120" w:type="dxa"/>
-            </w:tcMar>
-            <w:vAlign w:val="center"/>
-          </w:tcPr>
-          <w:p>
-            <w:r>
-              <w:rPr>
-                <w:rFonts w:ascii="Calibri" w:hAnsi="Calibri"/>
-                <w:b w:val="0"/>
-                <w:i w:val="0"/>
-                <w:color w:val="16202A"/>
-                <w:sz w:val="20"/>
-              </w:rPr>
-              <w:t>Na exclusão, digite o nome completo exatamente como aparece na lista.</w:t>
-            </w:r>
-          </w:p>
-        </w:tc>
-      </w:tr>
-      <w:tr>
-        <w:tc>
-          <w:tcPr>
-            <w:tcW w:type="dxa" w:w="2520"/>
-            <w:shd w:fill="F4F6F8"/>
-            <w:tcMar>
-              <w:top w:w="90" w:type="dxa"/>
-              <w:start w:w="120" w:type="dxa"/>
-              <w:bottom w:w="90" w:type="dxa"/>
-              <w:end w:w="120" w:type="dxa"/>
-            </w:tcMar>
-            <w:vAlign w:val="center"/>
-          </w:tcPr>
-          <w:p>
-            <w:r>
-              <w:rPr>
-                <w:rFonts w:ascii="Calibri" w:hAnsi="Calibri"/>
-                <w:b/>
-                <w:i w:val="0"/>
-                <w:color w:val="16202A"/>
-                <w:sz w:val="20"/>
-              </w:rPr>
-              <w:t>Ícone/lista não atualizou</w:t>
-            </w:r>
-          </w:p>
-        </w:tc>
-        <w:tc>
-          <w:tcPr>
-            <w:tcW w:type="dxa" w:w="7056"/>
-            <w:tcMar>
-              <w:top w:w="90" w:type="dxa"/>
-              <w:start w:w="120" w:type="dxa"/>
-              <w:bottom w:w="90" w:type="dxa"/>
-              <w:end w:w="120" w:type="dxa"/>
-            </w:tcMar>
-            <w:vAlign w:val="center"/>
-          </w:tcPr>
-          <w:p>
-            <w:r>
-              <w:rPr>
-                <w:rFonts w:ascii="Calibri" w:hAnsi="Calibri"/>
-                <w:b w:val="0"/>
-                <w:i w:val="0"/>
-                <w:color w:val="16202A"/>
-                <w:sz w:val="20"/>
-              </w:rPr>
-              <w:t>Clique em Atualizar ou feche e abra novamente o aplicativo.</w:t>
+              <w:t>Envie a operação, a mensagem e as últimas linhas do Log; nunca envie a senha.</w:t>
             </w:r>
           </w:p>
         </w:tc>
       </w:tr>
     </w:tbl>
     <w:p/>
-    <w:p>
-      <w:pPr>
-        <w:pStyle w:val="Heading1"/>
-      </w:pPr>
-      <w:r>
-        <w:t>15. Referência rápida</w:t>
-      </w:r>
-    </w:p>
-    <w:tbl>
-      <w:tblPr>
-        <w:tblStyle w:val="TableGrid"/>
-        <w:tblW w:type="auto" w:w="0"/>
-        <w:jc w:val="center"/>
-        <w:tblLayout w:type="fixed"/>
-        <w:tblLook w:firstColumn="1" w:firstRow="1" w:lastColumn="0" w:lastRow="0" w:noHBand="0" w:noVBand="1" w:val="04A0"/>
-      </w:tblPr>
-      <w:tblGrid>
-        <w:gridCol w:w="4896"/>
-        <w:gridCol w:w="4896"/>
-      </w:tblGrid>
-      <w:tr>
-        <w:trPr>
-          <w:tblHeader w:val="true"/>
-        </w:trPr>
-        <w:tc>
-          <w:tcPr>
-            <w:tcW w:type="dxa" w:w="2520"/>
-            <w:shd w:fill="00B8D4"/>
-            <w:tcMar>
-              <w:top w:w="90" w:type="dxa"/>
-              <w:start w:w="120" w:type="dxa"/>
-              <w:bottom w:w="90" w:type="dxa"/>
-              <w:end w:w="120" w:type="dxa"/>
-            </w:tcMar>
-            <w:vAlign w:val="center"/>
-          </w:tcPr>
-          <w:p>
-            <w:r>
-              <w:rPr>
-                <w:rFonts w:ascii="Calibri" w:hAnsi="Calibri"/>
-                <w:b/>
-                <w:i w:val="0"/>
-                <w:color w:val="FFFFFF"/>
-                <w:sz w:val="20"/>
-              </w:rPr>
-              <w:t>Recurso</w:t>
-            </w:r>
-          </w:p>
-        </w:tc>
-        <w:tc>
-          <w:tcPr>
-            <w:tcW w:type="dxa" w:w="7056"/>
-            <w:shd w:fill="00B8D4"/>
-            <w:tcMar>
-              <w:top w:w="90" w:type="dxa"/>
-              <w:start w:w="120" w:type="dxa"/>
-              <w:bottom w:w="90" w:type="dxa"/>
-              <w:end w:w="120" w:type="dxa"/>
-            </w:tcMar>
-            <w:vAlign w:val="center"/>
-          </w:tcPr>
-          <w:p>
-            <w:r>
-              <w:rPr>
-                <w:rFonts w:ascii="Calibri" w:hAnsi="Calibri"/>
-                <w:b/>
-                <w:i w:val="0"/>
-                <w:color w:val="FFFFFF"/>
-                <w:sz w:val="20"/>
-              </w:rPr>
-              <w:t>O que faz</w:t>
-            </w:r>
-          </w:p>
-        </w:tc>
-      </w:tr>
-      <w:tr>
-        <w:tc>
-          <w:tcPr>
-            <w:tcW w:type="dxa" w:w="2520"/>
-            <w:shd w:fill="F4F6F8"/>
-            <w:tcMar>
-              <w:top w:w="90" w:type="dxa"/>
-              <w:start w:w="120" w:type="dxa"/>
-              <w:bottom w:w="90" w:type="dxa"/>
-              <w:end w:w="120" w:type="dxa"/>
-            </w:tcMar>
-            <w:vAlign w:val="center"/>
-          </w:tcPr>
-          <w:p>
-            <w:r>
-              <w:rPr>
-                <w:rFonts w:ascii="Calibri" w:hAnsi="Calibri"/>
-                <w:b/>
-                <w:i w:val="0"/>
-                <w:color w:val="16202A"/>
-                <w:sz w:val="20"/>
-              </w:rPr>
-              <w:t>↑</w:t>
-            </w:r>
-          </w:p>
-        </w:tc>
-        <w:tc>
-          <w:tcPr>
-            <w:tcW w:type="dxa" w:w="7056"/>
-            <w:tcMar>
-              <w:top w:w="90" w:type="dxa"/>
-              <w:start w:w="120" w:type="dxa"/>
-              <w:bottom w:w="90" w:type="dxa"/>
-              <w:end w:w="120" w:type="dxa"/>
-            </w:tcMar>
-            <w:vAlign w:val="center"/>
-          </w:tcPr>
-          <w:p>
-            <w:r>
-              <w:rPr>
-                <w:rFonts w:ascii="Calibri" w:hAnsi="Calibri"/>
-                <w:b w:val="0"/>
-                <w:i w:val="0"/>
-                <w:color w:val="16202A"/>
-                <w:sz w:val="20"/>
-              </w:rPr>
-              <w:t>Voltar para a pasta anterior.</w:t>
-            </w:r>
-          </w:p>
-        </w:tc>
-      </w:tr>
-      <w:tr>
-        <w:tc>
-          <w:tcPr>
-            <w:tcW w:type="dxa" w:w="2520"/>
-            <w:shd w:fill="F4F6F8"/>
-            <w:tcMar>
-              <w:top w:w="90" w:type="dxa"/>
-              <w:start w:w="120" w:type="dxa"/>
-              <w:bottom w:w="90" w:type="dxa"/>
-              <w:end w:w="120" w:type="dxa"/>
-            </w:tcMar>
-            <w:vAlign w:val="center"/>
-          </w:tcPr>
-          <w:p>
-            <w:r>
-              <w:rPr>
-                <w:rFonts w:ascii="Calibri" w:hAnsi="Calibri"/>
-                <w:b/>
-                <w:i w:val="0"/>
-                <w:color w:val="16202A"/>
-                <w:sz w:val="20"/>
-              </w:rPr>
-              <w:t>Upload</w:t>
-            </w:r>
-          </w:p>
-        </w:tc>
-        <w:tc>
-          <w:tcPr>
-            <w:tcW w:type="dxa" w:w="7056"/>
-            <w:tcMar>
-              <w:top w:w="90" w:type="dxa"/>
-              <w:start w:w="120" w:type="dxa"/>
-              <w:bottom w:w="90" w:type="dxa"/>
-              <w:end w:w="120" w:type="dxa"/>
-            </w:tcMar>
-            <w:vAlign w:val="center"/>
-          </w:tcPr>
-          <w:p>
-            <w:r>
-              <w:rPr>
-                <w:rFonts w:ascii="Calibri" w:hAnsi="Calibri"/>
-                <w:b w:val="0"/>
-                <w:i w:val="0"/>
-                <w:color w:val="16202A"/>
-                <w:sz w:val="20"/>
-              </w:rPr>
-              <w:t>Enviar um arquivo local para a pasta remota atual.</w:t>
-            </w:r>
-          </w:p>
-        </w:tc>
-      </w:tr>
-      <w:tr>
-        <w:tc>
-          <w:tcPr>
-            <w:tcW w:type="dxa" w:w="2520"/>
-            <w:shd w:fill="F4F6F8"/>
-            <w:tcMar>
-              <w:top w:w="90" w:type="dxa"/>
-              <w:start w:w="120" w:type="dxa"/>
-              <w:bottom w:w="90" w:type="dxa"/>
-              <w:end w:w="120" w:type="dxa"/>
-            </w:tcMar>
-            <w:vAlign w:val="center"/>
-          </w:tcPr>
-          <w:p>
-            <w:r>
-              <w:rPr>
-                <w:rFonts w:ascii="Calibri" w:hAnsi="Calibri"/>
-                <w:b/>
-                <w:i w:val="0"/>
-                <w:color w:val="16202A"/>
-                <w:sz w:val="20"/>
-              </w:rPr>
-              <w:t>+ Pasta</w:t>
-            </w:r>
-          </w:p>
-        </w:tc>
-        <w:tc>
-          <w:tcPr>
-            <w:tcW w:type="dxa" w:w="7056"/>
-            <w:tcMar>
-              <w:top w:w="90" w:type="dxa"/>
-              <w:start w:w="120" w:type="dxa"/>
-              <w:bottom w:w="90" w:type="dxa"/>
-              <w:end w:w="120" w:type="dxa"/>
-            </w:tcMar>
-            <w:vAlign w:val="center"/>
-          </w:tcPr>
-          <w:p>
-            <w:r>
-              <w:rPr>
-                <w:rFonts w:ascii="Calibri" w:hAnsi="Calibri"/>
-                <w:b w:val="0"/>
-                <w:i w:val="0"/>
-                <w:color w:val="16202A"/>
-                <w:sz w:val="20"/>
-              </w:rPr>
-              <w:t>Criar uma subpasta na pasta atual.</w:t>
-            </w:r>
-          </w:p>
-        </w:tc>
-      </w:tr>
-      <w:tr>
-        <w:tc>
-          <w:tcPr>
-            <w:tcW w:type="dxa" w:w="2520"/>
-            <w:shd w:fill="F4F6F8"/>
-            <w:tcMar>
-              <w:top w:w="90" w:type="dxa"/>
-              <w:start w:w="120" w:type="dxa"/>
-              <w:bottom w:w="90" w:type="dxa"/>
-              <w:end w:w="120" w:type="dxa"/>
-            </w:tcMar>
-            <w:vAlign w:val="center"/>
-          </w:tcPr>
-          <w:p>
-            <w:r>
-              <w:rPr>
-                <w:rFonts w:ascii="Calibri" w:hAnsi="Calibri"/>
-                <w:b/>
-                <w:i w:val="0"/>
-                <w:color w:val="16202A"/>
-                <w:sz w:val="20"/>
-              </w:rPr>
-              <w:t>↓ CSV</w:t>
-            </w:r>
-          </w:p>
-        </w:tc>
-        <w:tc>
-          <w:tcPr>
-            <w:tcW w:type="dxa" w:w="7056"/>
-            <w:tcMar>
-              <w:top w:w="90" w:type="dxa"/>
-              <w:start w:w="120" w:type="dxa"/>
-              <w:bottom w:w="90" w:type="dxa"/>
-              <w:end w:w="120" w:type="dxa"/>
-            </w:tcMar>
-            <w:vAlign w:val="center"/>
-          </w:tcPr>
-          <w:p>
-            <w:r>
-              <w:rPr>
-                <w:rFonts w:ascii="Calibri" w:hAnsi="Calibri"/>
-                <w:b w:val="0"/>
-                <w:i w:val="0"/>
-                <w:color w:val="16202A"/>
-                <w:sz w:val="20"/>
-              </w:rPr>
-              <w:t>Baixar em lote no formato original.</w:t>
-            </w:r>
-          </w:p>
-        </w:tc>
-      </w:tr>
-      <w:tr>
-        <w:tc>
-          <w:tcPr>
-            <w:tcW w:type="dxa" w:w="2520"/>
-            <w:shd w:fill="F4F6F8"/>
-            <w:tcMar>
-              <w:top w:w="90" w:type="dxa"/>
-              <w:start w:w="120" w:type="dxa"/>
-              <w:bottom w:w="90" w:type="dxa"/>
-              <w:end w:w="120" w:type="dxa"/>
-            </w:tcMar>
-            <w:vAlign w:val="center"/>
-          </w:tcPr>
-          <w:p>
-            <w:r>
-              <w:rPr>
-                <w:rFonts w:ascii="Calibri" w:hAnsi="Calibri"/>
-                <w:b/>
-                <w:i w:val="0"/>
-                <w:color w:val="16202A"/>
-                <w:sz w:val="20"/>
-              </w:rPr>
-              <w:t>↓ xlsx</w:t>
-            </w:r>
-          </w:p>
-        </w:tc>
-        <w:tc>
-          <w:tcPr>
-            <w:tcW w:type="dxa" w:w="7056"/>
-            <w:tcMar>
-              <w:top w:w="90" w:type="dxa"/>
-              <w:start w:w="120" w:type="dxa"/>
-              <w:bottom w:w="90" w:type="dxa"/>
-              <w:end w:w="120" w:type="dxa"/>
-            </w:tcMar>
-            <w:vAlign w:val="center"/>
-          </w:tcPr>
-          <w:p>
-            <w:r>
-              <w:rPr>
-                <w:rFonts w:ascii="Calibri" w:hAnsi="Calibri"/>
-                <w:b w:val="0"/>
-                <w:i w:val="0"/>
-                <w:color w:val="16202A"/>
-                <w:sz w:val="20"/>
-              </w:rPr>
-              <w:t>Baixar em lote convertendo para Excel.</w:t>
-            </w:r>
-          </w:p>
-        </w:tc>
-      </w:tr>
-      <w:tr>
-        <w:tc>
-          <w:tcPr>
-            <w:tcW w:type="dxa" w:w="2520"/>
-            <w:shd w:fill="F4F6F8"/>
-            <w:tcMar>
-              <w:top w:w="90" w:type="dxa"/>
-              <w:start w:w="120" w:type="dxa"/>
-              <w:bottom w:w="90" w:type="dxa"/>
-              <w:end w:w="120" w:type="dxa"/>
-            </w:tcMar>
-            <w:vAlign w:val="center"/>
-          </w:tcPr>
-          <w:p>
-            <w:r>
-              <w:rPr>
-                <w:rFonts w:ascii="Calibri" w:hAnsi="Calibri"/>
-                <w:b/>
-                <w:i w:val="0"/>
-                <w:color w:val="16202A"/>
-                <w:sz w:val="20"/>
-              </w:rPr>
-              <w:t>↓ Ambos</w:t>
-            </w:r>
-          </w:p>
-        </w:tc>
-        <w:tc>
-          <w:tcPr>
-            <w:tcW w:type="dxa" w:w="7056"/>
-            <w:tcMar>
-              <w:top w:w="90" w:type="dxa"/>
-              <w:start w:w="120" w:type="dxa"/>
-              <w:bottom w:w="90" w:type="dxa"/>
-              <w:end w:w="120" w:type="dxa"/>
-            </w:tcMar>
-            <w:vAlign w:val="center"/>
-          </w:tcPr>
-          <w:p>
-            <w:r>
-              <w:rPr>
-                <w:rFonts w:ascii="Calibri" w:hAnsi="Calibri"/>
-                <w:b w:val="0"/>
-                <w:i w:val="0"/>
-                <w:color w:val="16202A"/>
-                <w:sz w:val="20"/>
-              </w:rPr>
-              <w:t>Baixar original e Excel.</w:t>
-            </w:r>
-          </w:p>
-        </w:tc>
-      </w:tr>
-      <w:tr>
-        <w:tc>
-          <w:tcPr>
-            <w:tcW w:type="dxa" w:w="2520"/>
-            <w:shd w:fill="F4F6F8"/>
-            <w:tcMar>
-              <w:top w:w="90" w:type="dxa"/>
-              <w:start w:w="120" w:type="dxa"/>
-              <w:bottom w:w="90" w:type="dxa"/>
-              <w:end w:w="120" w:type="dxa"/>
-            </w:tcMar>
-            <w:vAlign w:val="center"/>
-          </w:tcPr>
-          <w:p>
-            <w:r>
-              <w:rPr>
-                <w:rFonts w:ascii="Calibri" w:hAnsi="Calibri"/>
-                <w:b/>
-                <w:i w:val="0"/>
-                <w:color w:val="16202A"/>
-                <w:sz w:val="20"/>
-              </w:rPr>
-              <w:t>Atualizar</w:t>
-            </w:r>
-          </w:p>
-        </w:tc>
-        <w:tc>
-          <w:tcPr>
-            <w:tcW w:type="dxa" w:w="7056"/>
-            <w:tcMar>
-              <w:top w:w="90" w:type="dxa"/>
-              <w:start w:w="120" w:type="dxa"/>
-              <w:bottom w:w="90" w:type="dxa"/>
-              <w:end w:w="120" w:type="dxa"/>
-            </w:tcMar>
-            <w:vAlign w:val="center"/>
-          </w:tcPr>
-          <w:p>
-            <w:r>
-              <w:rPr>
-                <w:rFonts w:ascii="Calibri" w:hAnsi="Calibri"/>
-                <w:b w:val="0"/>
-                <w:i w:val="0"/>
-                <w:color w:val="16202A"/>
-                <w:sz w:val="20"/>
-              </w:rPr>
-              <w:t>Recarregar a listagem da pasta atual.</w:t>
-            </w:r>
-          </w:p>
-        </w:tc>
-      </w:tr>
-      <w:tr>
-        <w:tc>
-          <w:tcPr>
-            <w:tcW w:type="dxa" w:w="2520"/>
-            <w:shd w:fill="F4F6F8"/>
-            <w:tcMar>
-              <w:top w:w="90" w:type="dxa"/>
-              <w:start w:w="120" w:type="dxa"/>
-              <w:bottom w:w="90" w:type="dxa"/>
-              <w:end w:w="120" w:type="dxa"/>
-            </w:tcMar>
-            <w:vAlign w:val="center"/>
-          </w:tcPr>
-          <w:p>
-            <w:r>
-              <w:rPr>
-                <w:rFonts w:ascii="Calibri" w:hAnsi="Calibri"/>
-                <w:b/>
-                <w:i w:val="0"/>
-                <w:color w:val="16202A"/>
-                <w:sz w:val="20"/>
-              </w:rPr>
-              <w:t>down</w:t>
-            </w:r>
-          </w:p>
-        </w:tc>
-        <w:tc>
-          <w:tcPr>
-            <w:tcW w:type="dxa" w:w="7056"/>
-            <w:tcMar>
-              <w:top w:w="90" w:type="dxa"/>
-              <w:start w:w="120" w:type="dxa"/>
-              <w:bottom w:w="90" w:type="dxa"/>
-              <w:end w:w="120" w:type="dxa"/>
-            </w:tcMar>
-            <w:vAlign w:val="center"/>
-          </w:tcPr>
-          <w:p>
-            <w:r>
-              <w:rPr>
-                <w:rFonts w:ascii="Calibri" w:hAnsi="Calibri"/>
-                <w:b w:val="0"/>
-                <w:i w:val="0"/>
-                <w:color w:val="16202A"/>
-                <w:sz w:val="20"/>
-              </w:rPr>
-              <w:t>Baixar um arquivo individual.</w:t>
-            </w:r>
-          </w:p>
-        </w:tc>
-      </w:tr>
-      <w:tr>
-        <w:tc>
-          <w:tcPr>
-            <w:tcW w:type="dxa" w:w="2520"/>
-            <w:shd w:fill="F4F6F8"/>
-            <w:tcMar>
-              <w:top w:w="90" w:type="dxa"/>
-              <w:start w:w="120" w:type="dxa"/>
-              <w:bottom w:w="90" w:type="dxa"/>
-              <w:end w:w="120" w:type="dxa"/>
-            </w:tcMar>
-            <w:vAlign w:val="center"/>
-          </w:tcPr>
-          <w:p>
-            <w:r>
-              <w:rPr>
-                <w:rFonts w:ascii="Calibri" w:hAnsi="Calibri"/>
-                <w:b/>
-                <w:i w:val="0"/>
-                <w:color w:val="16202A"/>
-                <w:sz w:val="20"/>
-              </w:rPr>
-              <w:t>xlsx</w:t>
-            </w:r>
-          </w:p>
-        </w:tc>
-        <w:tc>
-          <w:tcPr>
-            <w:tcW w:type="dxa" w:w="7056"/>
-            <w:tcMar>
-              <w:top w:w="90" w:type="dxa"/>
-              <w:start w:w="120" w:type="dxa"/>
-              <w:bottom w:w="90" w:type="dxa"/>
-              <w:end w:w="120" w:type="dxa"/>
-            </w:tcMar>
-            <w:vAlign w:val="center"/>
-          </w:tcPr>
-          <w:p>
-            <w:r>
-              <w:rPr>
-                <w:rFonts w:ascii="Calibri" w:hAnsi="Calibri"/>
-                <w:b w:val="0"/>
-                <w:i w:val="0"/>
-                <w:color w:val="16202A"/>
-                <w:sz w:val="20"/>
-              </w:rPr>
-              <w:t>Baixar um CSV/TXT individual como Excel.</w:t>
-            </w:r>
-          </w:p>
-        </w:tc>
-      </w:tr>
-      <w:tr>
-        <w:tc>
-          <w:tcPr>
-            <w:tcW w:type="dxa" w:w="2520"/>
-            <w:shd w:fill="F4F6F8"/>
-            <w:tcMar>
-              <w:top w:w="90" w:type="dxa"/>
-              <w:start w:w="120" w:type="dxa"/>
-              <w:bottom w:w="90" w:type="dxa"/>
-              <w:end w:w="120" w:type="dxa"/>
-            </w:tcMar>
-            <w:vAlign w:val="center"/>
-          </w:tcPr>
-          <w:p>
-            <w:r>
-              <w:rPr>
-                <w:rFonts w:ascii="Calibri" w:hAnsi="Calibri"/>
-                <w:b/>
-                <w:i w:val="0"/>
-                <w:color w:val="16202A"/>
-                <w:sz w:val="20"/>
-              </w:rPr>
-              <w:t>ren</w:t>
-            </w:r>
-          </w:p>
-        </w:tc>
-        <w:tc>
-          <w:tcPr>
-            <w:tcW w:type="dxa" w:w="7056"/>
-            <w:tcMar>
-              <w:top w:w="90" w:type="dxa"/>
-              <w:start w:w="120" w:type="dxa"/>
-              <w:bottom w:w="90" w:type="dxa"/>
-              <w:end w:w="120" w:type="dxa"/>
-            </w:tcMar>
-            <w:vAlign w:val="center"/>
-          </w:tcPr>
-          <w:p>
-            <w:r>
-              <w:rPr>
-                <w:rFonts w:ascii="Calibri" w:hAnsi="Calibri"/>
-                <w:b w:val="0"/>
-                <w:i w:val="0"/>
-                <w:color w:val="16202A"/>
-                <w:sz w:val="20"/>
-              </w:rPr>
-              <w:t>Renomear arquivo ou pasta.</w:t>
-            </w:r>
-          </w:p>
-        </w:tc>
-      </w:tr>
-      <w:tr>
-        <w:tc>
-          <w:tcPr>
-            <w:tcW w:type="dxa" w:w="2520"/>
-            <w:shd w:fill="F4F6F8"/>
-            <w:tcMar>
-              <w:top w:w="90" w:type="dxa"/>
-              <w:start w:w="120" w:type="dxa"/>
-              <w:bottom w:w="90" w:type="dxa"/>
-              <w:end w:w="120" w:type="dxa"/>
-            </w:tcMar>
-            <w:vAlign w:val="center"/>
-          </w:tcPr>
-          <w:p>
-            <w:r>
-              <w:rPr>
-                <w:rFonts w:ascii="Calibri" w:hAnsi="Calibri"/>
-                <w:b/>
-                <w:i w:val="0"/>
-                <w:color w:val="16202A"/>
-                <w:sz w:val="20"/>
-              </w:rPr>
-              <w:t>del</w:t>
-            </w:r>
-          </w:p>
-        </w:tc>
-        <w:tc>
-          <w:tcPr>
-            <w:tcW w:type="dxa" w:w="7056"/>
-            <w:tcMar>
-              <w:top w:w="90" w:type="dxa"/>
-              <w:start w:w="120" w:type="dxa"/>
-              <w:bottom w:w="90" w:type="dxa"/>
-              <w:end w:w="120" w:type="dxa"/>
-            </w:tcMar>
-            <w:vAlign w:val="center"/>
-          </w:tcPr>
-          <w:p>
-            <w:r>
-              <w:rPr>
-                <w:rFonts w:ascii="Calibri" w:hAnsi="Calibri"/>
-                <w:b w:val="0"/>
-                <w:i w:val="0"/>
-                <w:color w:val="16202A"/>
-                <w:sz w:val="20"/>
-              </w:rPr>
-              <w:t>Excluir arquivo ou pasta mediante confirmação do nome.</w:t>
-            </w:r>
-          </w:p>
-        </w:tc>
-      </w:tr>
-    </w:tbl>
-    <w:p/>
-    <w:tbl>
-      <w:tblPr>
-        <w:tblW w:type="auto" w:w="0"/>
-        <w:jc w:val="center"/>
-        <w:tblLayout w:type="fixed"/>
-        <w:tblLook w:firstColumn="1" w:firstRow="1" w:lastColumn="0" w:lastRow="0" w:noHBand="0" w:noVBand="1" w:val="04A0"/>
-      </w:tblPr>
-      <w:tblGrid>
-        <w:gridCol w:w="9792"/>
-      </w:tblGrid>
-      <w:tr>
-        <w:tc>
-          <w:tcPr>
-            <w:tcW w:type="dxa" w:w="9576"/>
-            <w:shd w:fill="EAF8FB"/>
-            <w:tcMar>
-              <w:top w:w="120" w:type="dxa"/>
-              <w:start w:w="160" w:type="dxa"/>
-              <w:bottom w:w="120" w:type="dxa"/>
-              <w:end w:w="160" w:type="dxa"/>
-            </w:tcMar>
-          </w:tcPr>
-          <w:p>
-            <w:pPr>
-              <w:spacing w:after="0"/>
-            </w:pPr>
-            <w:r>
-              <w:rPr>
-                <w:rFonts w:ascii="Calibri" w:hAnsi="Calibri"/>
-                <w:b/>
-                <w:i w:val="0"/>
-                <w:color w:val="16202A"/>
-                <w:sz w:val="20"/>
-              </w:rPr>
-              <w:t xml:space="preserve">Suporte: </w:t>
-            </w:r>
-            <w:r>
-              <w:rPr>
-                <w:rFonts w:ascii="Calibri" w:hAnsi="Calibri"/>
-                <w:b w:val="0"/>
-                <w:i w:val="0"/>
-                <w:color w:val="16202A"/>
-                <w:sz w:val="20"/>
-              </w:rPr>
-              <w:t>Ao solicitar ajuda, informe a operação realizada, a mensagem exibida e as últimas linhas do painel Log. Nunca envie sua senha.</w:t>
-            </w:r>
-          </w:p>
-        </w:tc>
-      </w:tr>
-    </w:tbl>
-    <w:p>
-      <w:pPr>
-        <w:spacing w:after="20"/>
-      </w:pPr>
-    </w:p>
     <w:sectPr>
       <w:headerReference w:type="default" r:id="rId10"/>
       <w:footerReference w:type="default" r:id="rId11"/>

</xml_diff>

<commit_message>
Corrigir publicacao da Release
</commit_message>
<xml_diff>
--- a/Manual-do-Usuario-Mavi-SFTP.docx
+++ b/Manual-do-Usuario-Mavi-SFTP.docx
@@ -93,6 +93,291 @@
       <w:r>
         <w:br w:type="page"/>
       </w:r>
+    </w:p>
+    <w:p>
+      <w:pPr>
+        <w:pStyle w:val="Heading1"/>
+      </w:pPr>
+      <w:r>
+        <w:t>Conteúdo do manual</w:t>
+      </w:r>
+    </w:p>
+    <w:tbl>
+      <w:tblPr>
+        <w:tblStyle w:val="TableGrid"/>
+        <w:tblW w:type="auto" w:w="0"/>
+        <w:jc w:val="center"/>
+        <w:tblLayout w:type="fixed"/>
+        <w:tblLook w:firstColumn="1" w:firstRow="1" w:lastColumn="0" w:lastRow="0" w:noHBand="0" w:noVBand="1" w:val="04A0"/>
+      </w:tblPr>
+      <w:tblGrid>
+        <w:gridCol w:w="4896"/>
+        <w:gridCol w:w="4896"/>
+      </w:tblGrid>
+      <w:tr>
+        <w:trPr>
+          <w:tblHeader w:val="true"/>
+        </w:trPr>
+        <w:tc>
+          <w:tcPr>
+            <w:tcW w:type="dxa" w:w="2520"/>
+            <w:shd w:fill="00B8D4"/>
+            <w:tcMar>
+              <w:top w:w="90" w:type="dxa"/>
+              <w:start w:w="120" w:type="dxa"/>
+              <w:bottom w:w="90" w:type="dxa"/>
+              <w:end w:w="120" w:type="dxa"/>
+            </w:tcMar>
+            <w:vAlign w:val="center"/>
+          </w:tcPr>
+          <w:p>
+            <w:r>
+              <w:rPr>
+                <w:rFonts w:ascii="Calibri" w:hAnsi="Calibri"/>
+                <w:b/>
+                <w:i w:val="0"/>
+                <w:color w:val="FFFFFF"/>
+                <w:sz w:val="20"/>
+              </w:rPr>
+              <w:t>Recurso</w:t>
+            </w:r>
+          </w:p>
+        </w:tc>
+        <w:tc>
+          <w:tcPr>
+            <w:tcW w:type="dxa" w:w="7056"/>
+            <w:shd w:fill="00B8D4"/>
+            <w:tcMar>
+              <w:top w:w="90" w:type="dxa"/>
+              <w:start w:w="120" w:type="dxa"/>
+              <w:bottom w:w="90" w:type="dxa"/>
+              <w:end w:w="120" w:type="dxa"/>
+            </w:tcMar>
+            <w:vAlign w:val="center"/>
+          </w:tcPr>
+          <w:p>
+            <w:r>
+              <w:rPr>
+                <w:rFonts w:ascii="Calibri" w:hAnsi="Calibri"/>
+                <w:b/>
+                <w:i w:val="0"/>
+                <w:color w:val="FFFFFF"/>
+                <w:sz w:val="20"/>
+              </w:rPr>
+              <w:t>O que faz</w:t>
+            </w:r>
+          </w:p>
+        </w:tc>
+      </w:tr>
+      <w:tr>
+        <w:tc>
+          <w:tcPr>
+            <w:tcW w:type="dxa" w:w="2520"/>
+            <w:shd w:fill="F4F6F8"/>
+            <w:tcMar>
+              <w:top w:w="90" w:type="dxa"/>
+              <w:start w:w="120" w:type="dxa"/>
+              <w:bottom w:w="90" w:type="dxa"/>
+              <w:end w:w="120" w:type="dxa"/>
+            </w:tcMar>
+            <w:vAlign w:val="center"/>
+          </w:tcPr>
+          <w:p>
+            <w:r>
+              <w:rPr>
+                <w:rFonts w:ascii="Calibri" w:hAnsi="Calibri"/>
+                <w:b/>
+                <w:i w:val="0"/>
+                <w:color w:val="16202A"/>
+                <w:sz w:val="20"/>
+              </w:rPr>
+              <w:t>Seções 1 a 5</w:t>
+            </w:r>
+          </w:p>
+        </w:tc>
+        <w:tc>
+          <w:tcPr>
+            <w:tcW w:type="dxa" w:w="7056"/>
+            <w:tcMar>
+              <w:top w:w="90" w:type="dxa"/>
+              <w:start w:w="120" w:type="dxa"/>
+              <w:bottom w:w="90" w:type="dxa"/>
+              <w:end w:w="120" w:type="dxa"/>
+            </w:tcMar>
+            <w:vAlign w:val="center"/>
+          </w:tcPr>
+          <w:p>
+            <w:r>
+              <w:rPr>
+                <w:rFonts w:ascii="Calibri" w:hAnsi="Calibri"/>
+                <w:b w:val="0"/>
+                <w:i w:val="0"/>
+                <w:color w:val="16202A"/>
+                <w:sz w:val="20"/>
+              </w:rPr>
+              <w:t>Uso rápido: instalação, conexão, navegação, arquivos e downloads.</w:t>
+            </w:r>
+          </w:p>
+        </w:tc>
+      </w:tr>
+      <w:tr>
+        <w:tc>
+          <w:tcPr>
+            <w:tcW w:type="dxa" w:w="2520"/>
+            <w:shd w:fill="F4F6F8"/>
+            <w:tcMar>
+              <w:top w:w="90" w:type="dxa"/>
+              <w:start w:w="120" w:type="dxa"/>
+              <w:bottom w:w="90" w:type="dxa"/>
+              <w:end w:w="120" w:type="dxa"/>
+            </w:tcMar>
+            <w:vAlign w:val="center"/>
+          </w:tcPr>
+          <w:p>
+            <w:r>
+              <w:rPr>
+                <w:rFonts w:ascii="Calibri" w:hAnsi="Calibri"/>
+                <w:b/>
+                <w:i w:val="0"/>
+                <w:color w:val="16202A"/>
+                <w:sz w:val="20"/>
+              </w:rPr>
+              <w:t>SEÇÃO 6</w:t>
+            </w:r>
+          </w:p>
+        </w:tc>
+        <w:tc>
+          <w:tcPr>
+            <w:tcW w:type="dxa" w:w="7056"/>
+            <w:tcMar>
+              <w:top w:w="90" w:type="dxa"/>
+              <w:start w:w="120" w:type="dxa"/>
+              <w:bottom w:w="90" w:type="dxa"/>
+              <w:end w:w="120" w:type="dxa"/>
+            </w:tcMar>
+            <w:vAlign w:val="center"/>
+          </w:tcPr>
+          <w:p>
+            <w:r>
+              <w:rPr>
+                <w:rFonts w:ascii="Calibri" w:hAnsi="Calibri"/>
+                <w:b w:val="0"/>
+                <w:i w:val="0"/>
+                <w:color w:val="16202A"/>
+                <w:sz w:val="20"/>
+              </w:rPr>
+              <w:t>TRATAMENTO DE BASES DIÁRIAS — PASSO A PASSO DETALHADO.</w:t>
+            </w:r>
+          </w:p>
+        </w:tc>
+      </w:tr>
+      <w:tr>
+        <w:tc>
+          <w:tcPr>
+            <w:tcW w:type="dxa" w:w="2520"/>
+            <w:shd w:fill="F4F6F8"/>
+            <w:tcMar>
+              <w:top w:w="90" w:type="dxa"/>
+              <w:start w:w="120" w:type="dxa"/>
+              <w:bottom w:w="90" w:type="dxa"/>
+              <w:end w:w="120" w:type="dxa"/>
+            </w:tcMar>
+            <w:vAlign w:val="center"/>
+          </w:tcPr>
+          <w:p>
+            <w:r>
+              <w:rPr>
+                <w:rFonts w:ascii="Calibri" w:hAnsi="Calibri"/>
+                <w:b/>
+                <w:i w:val="0"/>
+                <w:color w:val="16202A"/>
+                <w:sz w:val="20"/>
+              </w:rPr>
+              <w:t>Seções 7 e 8</w:t>
+            </w:r>
+          </w:p>
+        </w:tc>
+        <w:tc>
+          <w:tcPr>
+            <w:tcW w:type="dxa" w:w="7056"/>
+            <w:tcMar>
+              <w:top w:w="90" w:type="dxa"/>
+              <w:start w:w="120" w:type="dxa"/>
+              <w:bottom w:w="90" w:type="dxa"/>
+              <w:end w:w="120" w:type="dxa"/>
+            </w:tcMar>
+            <w:vAlign w:val="center"/>
+          </w:tcPr>
+          <w:p>
+            <w:r>
+              <w:rPr>
+                <w:rFonts w:ascii="Calibri" w:hAnsi="Calibri"/>
+                <w:b w:val="0"/>
+                <w:i w:val="0"/>
+                <w:color w:val="16202A"/>
+                <w:sz w:val="20"/>
+              </w:rPr>
+              <w:t>Atualizações e solução rápida de problemas.</w:t>
+            </w:r>
+          </w:p>
+        </w:tc>
+      </w:tr>
+    </w:tbl>
+    <w:p/>
+    <w:tbl>
+      <w:tblPr>
+        <w:tblW w:type="auto" w:w="0"/>
+        <w:jc w:val="center"/>
+        <w:tblLayout w:type="fixed"/>
+        <w:tblLook w:firstColumn="1" w:firstRow="1" w:lastColumn="0" w:lastRow="0" w:noHBand="0" w:noVBand="1" w:val="04A0"/>
+      </w:tblPr>
+      <w:tblGrid>
+        <w:gridCol w:w="9792"/>
+      </w:tblGrid>
+      <w:tr>
+        <w:tc>
+          <w:tcPr>
+            <w:tcW w:type="dxa" w:w="9576"/>
+            <w:shd w:fill="EAF8FB"/>
+            <w:tcMar>
+              <w:top w:w="120" w:type="dxa"/>
+              <w:start w:w="160" w:type="dxa"/>
+              <w:bottom w:w="120" w:type="dxa"/>
+              <w:end w:w="160" w:type="dxa"/>
+            </w:tcMar>
+          </w:tcPr>
+          <w:p>
+            <w:pPr>
+              <w:spacing w:after="0"/>
+            </w:pPr>
+            <w:r>
+              <w:rPr>
+                <w:rFonts w:ascii="Calibri" w:hAnsi="Calibri"/>
+                <w:b/>
+                <w:i w:val="0"/>
+                <w:color w:val="16202A"/>
+                <w:sz w:val="20"/>
+              </w:rPr>
+              <w:t xml:space="preserve">Principal: </w:t>
+            </w:r>
+            <w:r>
+              <w:rPr>
+                <w:rFonts w:ascii="Calibri" w:hAnsi="Calibri"/>
+                <w:b w:val="0"/>
+                <w:i w:val="0"/>
+                <w:color w:val="16202A"/>
+                <w:sz w:val="20"/>
+              </w:rPr>
+              <w:t>O processo completo de vendas diárias começa na seção 6, em uma página exclusiva e com sete subseções operacionais.</w:t>
+            </w:r>
+          </w:p>
+        </w:tc>
+      </w:tr>
+    </w:tbl>
+    <w:p>
+      <w:pPr>
+        <w:spacing w:after="20"/>
+      </w:pPr>
     </w:p>
     <w:p>
       <w:pPr>
@@ -1164,11 +1449,16 @@
       </w:pPr>
     </w:p>
     <w:p>
+      <w:r>
+        <w:br w:type="page"/>
+      </w:r>
+    </w:p>
+    <w:p>
       <w:pPr>
         <w:pStyle w:val="Heading1"/>
       </w:pPr>
       <w:r>
-        <w:t>6. Tratamento de bases de Venda Diária</w:t>
+        <w:t>6. TRATAMENTO DE BASES DIÁRIAS — PASSO A PASSO DETALHADO</w:t>
       </w:r>
     </w:p>
     <w:p>

</xml_diff>